<commit_message>
docs(G3-03): complete rendered overview design QA
</commit_message>
<xml_diff>
--- a/docs/deliverables/11-概要设计说明书.docx
+++ b/docs/deliverables/11-概要设计说明书.docx
@@ -231,7 +231,7 @@
     </w:p>
     <w:p>
       <w:r>
-        <w:t>整体关系如图 2-1 所示。渠道经统一 API 边界调用领域模块；领域模块拥有业务规则和写入责任，外部平台只经独立适配端口访问。</w:t>
+        <w:t>整体分层关系见表 2-1。渠道经统一 API 边界调用领域模块；领域模块拥有业务规则和写入责任，外部平台只经独立适配端口访问。</w:t>
       </w:r>
     </w:p>
     <w:tbl>
@@ -355,6 +355,9 @@
       </w:tr>
     </w:tbl>
     <w:p>
+      <w:pPr>
+        <w:jc w:val="center"/>
+      </w:pPr>
       <w:r>
         <w:t>表 2-1 逻辑技术架构分层</w:t>
       </w:r>
@@ -555,6 +558,14 @@
     </w:tbl>
     <w:p>
       <w:pPr>
+        <w:jc w:val="center"/>
+      </w:pPr>
+      <w:r>
+        <w:t>表 2-2 模块职责与依赖</w:t>
+      </w:r>
+    </w:p>
+    <w:p>
+      <w:pPr>
         <w:pStyle w:val="1"/>
       </w:pPr>
       <w:r>
@@ -701,6 +712,14 @@
     </w:tbl>
     <w:p>
       <w:pPr>
+        <w:jc w:val="center"/>
+      </w:pPr>
+      <w:r>
+        <w:t>表 4-1 部署故障域与恢复约束</w:t>
+      </w:r>
+    </w:p>
+    <w:p>
+      <w:pPr>
         <w:pStyle w:val="1"/>
       </w:pPr>
       <w:r>
@@ -837,6 +856,14 @@
         </w:tc>
       </w:tr>
     </w:tbl>
+    <w:p>
+      <w:pPr>
+        <w:jc w:val="center"/>
+      </w:pPr>
+      <w:r>
+        <w:t>表 5-1 主要非功能设计预算</w:t>
+      </w:r>
+    </w:p>
     <w:p>
       <w:pPr>
         <w:pStyle w:val="1"/>
@@ -1048,6 +1075,14 @@
         </w:tc>
       </w:tr>
     </w:tbl>
+    <w:p>
+      <w:pPr>
+        <w:jc w:val="center"/>
+      </w:pPr>
+      <w:r>
+        <w:t>表 6-1 需求与设计元素追踪</w:t>
+      </w:r>
+    </w:p>
     <w:p>
       <w:r>
         <w:t>G3-08 将完成39条 FR、34条★FR、117条 AC 的双向设计挂接；本表不替代 RTM。</w:t>

</xml_diff>

<commit_message>
style(G3-03): align overview design with reference
</commit_message>
<xml_diff>
--- a/docs/deliverables/11-概要设计说明书.docx
+++ b/docs/deliverables/11-概要设计说明书.docx
@@ -4,12 +4,15 @@
   <w:body>
     <w:p>
       <w:pPr>
-        <w:jc w:val="center"/>
+        <w:spacing w:after="100" w:line="360" w:lineRule="auto"/>
+        <w:ind w:firstLine="475"/>
       </w:pPr>
       <w:r>
         <w:rPr>
-          <w:b/>
-          <w:sz w:val="36"/>
+          <w:rFonts w:eastAsia="宋体"/>
+          <w:color w:val="000000"/>
+          <w:sz w:val="24"/>
+          <w:szCs w:val="24"/>
         </w:rPr>
         <w:t>某自然博物馆智能运营中心建设项目</w:t>
         <w:br/>
@@ -18,53 +21,91 @@
     </w:p>
     <w:p>
       <w:pPr>
-        <w:jc w:val="center"/>
+        <w:spacing w:after="100" w:line="360" w:lineRule="auto"/>
+        <w:ind w:firstLine="475"/>
       </w:pPr>
       <w:r>
         <w:rPr>
-          <w:b/>
-          <w:sz w:val="44"/>
+          <w:rFonts w:eastAsia="宋体"/>
+          <w:color w:val="000000"/>
+          <w:sz w:val="24"/>
+          <w:szCs w:val="24"/>
         </w:rPr>
         <w:t>概要设计说明书</w:t>
       </w:r>
     </w:p>
     <w:p>
       <w:pPr>
-        <w:jc w:val="center"/>
-      </w:pPr>
-      <w:r>
+        <w:spacing w:after="100" w:line="360" w:lineRule="auto"/>
+        <w:ind w:firstLine="475"/>
+      </w:pPr>
+      <w:r>
+        <w:rPr>
+          <w:rFonts w:eastAsia="宋体"/>
+          <w:color w:val="000000"/>
+          <w:sz w:val="24"/>
+          <w:szCs w:val="24"/>
+        </w:rPr>
         <w:t>文档编号：EM-G3-03</w:t>
       </w:r>
     </w:p>
     <w:p>
       <w:pPr>
-        <w:jc w:val="center"/>
-      </w:pPr>
-      <w:r>
+        <w:spacing w:after="100" w:line="360" w:lineRule="auto"/>
+        <w:ind w:firstLine="475"/>
+      </w:pPr>
+      <w:r>
+        <w:rPr>
+          <w:rFonts w:eastAsia="宋体"/>
+          <w:color w:val="000000"/>
+          <w:sz w:val="24"/>
+          <w:szCs w:val="24"/>
+        </w:rPr>
         <w:t>版本：V0.1（评审稿）</w:t>
       </w:r>
     </w:p>
     <w:p>
       <w:pPr>
-        <w:jc w:val="center"/>
-      </w:pPr>
-      <w:r>
+        <w:spacing w:after="100" w:line="360" w:lineRule="auto"/>
+        <w:ind w:firstLine="475"/>
+      </w:pPr>
+      <w:r>
+        <w:rPr>
+          <w:rFonts w:eastAsia="宋体"/>
+          <w:color w:val="000000"/>
+          <w:sz w:val="24"/>
+          <w:szCs w:val="24"/>
+        </w:rPr>
         <w:t>编制：A【待人工确认】</w:t>
       </w:r>
     </w:p>
     <w:p>
       <w:pPr>
-        <w:jc w:val="center"/>
-      </w:pPr>
-      <w:r>
+        <w:spacing w:after="100" w:line="360" w:lineRule="auto"/>
+        <w:ind w:firstLine="475"/>
+      </w:pPr>
+      <w:r>
+        <w:rPr>
+          <w:rFonts w:eastAsia="宋体"/>
+          <w:color w:val="000000"/>
+          <w:sz w:val="24"/>
+          <w:szCs w:val="24"/>
+        </w:rPr>
         <w:t>复核：C【待人工确认】</w:t>
       </w:r>
     </w:p>
     <w:p>
       <w:pPr>
-        <w:jc w:val="center"/>
-      </w:pPr>
-      <w:r>
+        <w:spacing w:after="100" w:line="360" w:lineRule="auto"/>
+        <w:ind w:firstLine="475"/>
+      </w:pPr>
+      <w:r>
+        <w:rPr>
+          <w:rFonts w:eastAsia="宋体"/>
+          <w:color w:val="000000"/>
+          <w:sz w:val="24"/>
+          <w:szCs w:val="24"/>
+        </w:rPr>
         <w:t>日期：2026年09月17日</w:t>
       </w:r>
     </w:p>
@@ -76,15 +117,34 @@
     <w:p>
       <w:pPr>
         <w:pStyle w:val="1"/>
-      </w:pPr>
-      <w:r>
+        <w:spacing w:before="240" w:after="160"/>
+      </w:pPr>
+      <w:r>
+        <w:rPr>
+          <w:rFonts w:eastAsia="黑体"/>
+          <w:b/>
+          <w:bCs/>
+        </w:rPr>
         <w:t>修订记录</w:t>
       </w:r>
     </w:p>
     <w:tbl>
       <w:tblPr>
-        <w:tblW w:type="auto" w:w="0"/>
-        <w:tblLook w:firstColumn="1" w:firstRow="1" w:lastColumn="0" w:lastRow="0" w:noHBand="0" w:noVBand="1" w:val="04A0"/>
+        <w:tblW w:w="0" w:type="auto"/>
+        <w:jc w:val="center"/>
+        <w:tblBorders>
+          <w:top w:val="single" w:sz="4" w:space="0" w:color="808080"/>
+          <w:left w:val="single" w:sz="4" w:space="0" w:color="808080"/>
+          <w:bottom w:val="single" w:sz="4" w:space="0" w:color="808080"/>
+          <w:right w:val="single" w:sz="4" w:space="0" w:color="808080"/>
+          <w:insideH w:val="single" w:sz="4" w:space="0" w:color="808080"/>
+          <w:insideV w:val="single" w:sz="4" w:space="0" w:color="808080"/>
+        </w:tblBorders>
+        <w:tblCellMar>
+          <w:left w:w="10" w:type="dxa"/>
+          <w:right w:w="10" w:type="dxa"/>
+        </w:tblCellMar>
+        <w:tblLook w:val="04A0" w:firstRow="1" w:lastRow="0" w:firstColumn="1" w:lastColumn="0" w:noHBand="0" w:noVBand="1"/>
       </w:tblPr>
       <w:tblGrid>
         <w:gridCol w:w="2256"/>
@@ -98,7 +158,17 @@
             <w:tcW w:type="dxa" w:w="2256"/>
           </w:tcPr>
           <w:p>
-            <w:r>
+            <w:pPr>
+              <w:spacing w:after="100" w:line="360" w:lineRule="auto"/>
+              <w:ind w:firstLine="475"/>
+            </w:pPr>
+            <w:r>
+              <w:rPr>
+                <w:rFonts w:eastAsia="宋体"/>
+                <w:color w:val="000000"/>
+                <w:sz w:val="24"/>
+                <w:szCs w:val="24"/>
+              </w:rPr>
               <w:t>版本</w:t>
             </w:r>
           </w:p>
@@ -108,7 +178,17 @@
             <w:tcW w:type="dxa" w:w="2256"/>
           </w:tcPr>
           <w:p>
-            <w:r>
+            <w:pPr>
+              <w:spacing w:after="100" w:line="360" w:lineRule="auto"/>
+              <w:ind w:firstLine="475"/>
+            </w:pPr>
+            <w:r>
+              <w:rPr>
+                <w:rFonts w:eastAsia="宋体"/>
+                <w:color w:val="000000"/>
+                <w:sz w:val="24"/>
+                <w:szCs w:val="24"/>
+              </w:rPr>
               <w:t>日期</w:t>
             </w:r>
           </w:p>
@@ -118,7 +198,17 @@
             <w:tcW w:type="dxa" w:w="2256"/>
           </w:tcPr>
           <w:p>
-            <w:r>
+            <w:pPr>
+              <w:spacing w:after="100" w:line="360" w:lineRule="auto"/>
+              <w:ind w:firstLine="475"/>
+            </w:pPr>
+            <w:r>
+              <w:rPr>
+                <w:rFonts w:eastAsia="宋体"/>
+                <w:color w:val="000000"/>
+                <w:sz w:val="24"/>
+                <w:szCs w:val="24"/>
+              </w:rPr>
               <w:t>修改说明</w:t>
             </w:r>
           </w:p>
@@ -128,7 +218,17 @@
             <w:tcW w:type="dxa" w:w="2256"/>
           </w:tcPr>
           <w:p>
-            <w:r>
+            <w:pPr>
+              <w:spacing w:after="100" w:line="360" w:lineRule="auto"/>
+              <w:ind w:firstLine="475"/>
+            </w:pPr>
+            <w:r>
+              <w:rPr>
+                <w:rFonts w:eastAsia="宋体"/>
+                <w:color w:val="000000"/>
+                <w:sz w:val="24"/>
+                <w:szCs w:val="24"/>
+              </w:rPr>
               <w:t>责任人</w:t>
             </w:r>
           </w:p>
@@ -140,7 +240,17 @@
             <w:tcW w:type="dxa" w:w="2256"/>
           </w:tcPr>
           <w:p>
-            <w:r>
+            <w:pPr>
+              <w:spacing w:after="100" w:line="360" w:lineRule="auto"/>
+              <w:ind w:firstLine="475"/>
+            </w:pPr>
+            <w:r>
+              <w:rPr>
+                <w:rFonts w:eastAsia="宋体"/>
+                <w:color w:val="000000"/>
+                <w:sz w:val="24"/>
+                <w:szCs w:val="24"/>
+              </w:rPr>
               <w:t>V0.1</w:t>
             </w:r>
           </w:p>
@@ -150,7 +260,17 @@
             <w:tcW w:type="dxa" w:w="2256"/>
           </w:tcPr>
           <w:p>
-            <w:r>
+            <w:pPr>
+              <w:spacing w:after="100" w:line="360" w:lineRule="auto"/>
+              <w:ind w:firstLine="475"/>
+            </w:pPr>
+            <w:r>
+              <w:rPr>
+                <w:rFonts w:eastAsia="宋体"/>
+                <w:color w:val="000000"/>
+                <w:sz w:val="24"/>
+                <w:szCs w:val="24"/>
+              </w:rPr>
               <w:t>2026-09-17</w:t>
             </w:r>
           </w:p>
@@ -160,7 +280,17 @@
             <w:tcW w:type="dxa" w:w="2256"/>
           </w:tcPr>
           <w:p>
-            <w:r>
+            <w:pPr>
+              <w:spacing w:after="100" w:line="360" w:lineRule="auto"/>
+              <w:ind w:firstLine="475"/>
+            </w:pPr>
+            <w:r>
+              <w:rPr>
+                <w:rFonts w:eastAsia="宋体"/>
+                <w:color w:val="000000"/>
+                <w:sz w:val="24"/>
+                <w:szCs w:val="24"/>
+              </w:rPr>
               <w:t>首次形成概要设计评审稿</w:t>
             </w:r>
           </w:p>
@@ -170,7 +300,17 @@
             <w:tcW w:type="dxa" w:w="2256"/>
           </w:tcPr>
           <w:p>
-            <w:r>
+            <w:pPr>
+              <w:spacing w:after="100" w:line="360" w:lineRule="auto"/>
+              <w:ind w:firstLine="475"/>
+            </w:pPr>
+            <w:r>
+              <w:rPr>
+                <w:rFonts w:eastAsia="宋体"/>
+                <w:color w:val="000000"/>
+                <w:sz w:val="24"/>
+                <w:szCs w:val="24"/>
+              </w:rPr>
               <w:t>A【待人工确认】</w:t>
             </w:r>
           </w:p>
@@ -185,59 +325,139 @@
     <w:p>
       <w:pPr>
         <w:pStyle w:val="1"/>
-      </w:pPr>
-      <w:r>
+        <w:spacing w:before="240" w:after="160"/>
+      </w:pPr>
+      <w:r>
+        <w:rPr>
+          <w:rFonts w:eastAsia="黑体"/>
+          <w:b/>
+          <w:bCs/>
+        </w:rPr>
         <w:t>1 引言</w:t>
       </w:r>
     </w:p>
     <w:p>
-      <w:r>
+      <w:pPr>
+        <w:spacing w:after="100" w:line="360" w:lineRule="auto"/>
+        <w:ind w:firstLine="475"/>
+      </w:pPr>
+      <w:r>
+        <w:rPr>
+          <w:rFonts w:eastAsia="宋体"/>
+          <w:color w:val="000000"/>
+          <w:sz w:val="24"/>
+          <w:szCs w:val="24"/>
+        </w:rPr>
         <w:t>本说明书定义应急管理子系统的高层逻辑架构、数据边界、部署边界、外部系统边界及非功能设计约束，为后续数据库、详细设计、接口契约、ADR、RTM 和测试计划提供受控输入。</w:t>
       </w:r>
     </w:p>
     <w:p>
       <w:pPr>
         <w:pStyle w:val="2"/>
-      </w:pPr>
-      <w:r>
+        <w:spacing w:before="240" w:after="160"/>
+      </w:pPr>
+      <w:r>
+        <w:rPr>
+          <w:rFonts w:eastAsia="黑体"/>
+          <w:b/>
+          <w:bCs/>
+          <w:sz w:val="28"/>
+          <w:szCs w:val="28"/>
+        </w:rPr>
         <w:t>1.1 设计范围</w:t>
       </w:r>
     </w:p>
     <w:p>
-      <w:r>
+      <w:pPr>
+        <w:spacing w:after="100" w:line="360" w:lineRule="auto"/>
+        <w:ind w:firstLine="475"/>
+      </w:pPr>
+      <w:r>
+        <w:rPr>
+          <w:rFonts w:eastAsia="宋体"/>
+          <w:color w:val="000000"/>
+          <w:sz w:val="24"/>
+          <w:szCs w:val="24"/>
+        </w:rPr>
         <w:t>本设计覆盖 Web、大屏和 H5 渠道接入的应急业务逻辑架构。它不定义类、状态机细节、物理表、字段长度、索引、数据库产品或完整接口字段。原型 Mock、localStorage 和 prototypeStore 不构成正式架构依据。</w:t>
       </w:r>
     </w:p>
     <w:p>
       <w:pPr>
         <w:pStyle w:val="2"/>
-      </w:pPr>
-      <w:r>
+        <w:spacing w:before="240" w:after="160"/>
+      </w:pPr>
+      <w:r>
+        <w:rPr>
+          <w:rFonts w:eastAsia="黑体"/>
+          <w:b/>
+          <w:bCs/>
+          <w:sz w:val="28"/>
+          <w:szCs w:val="28"/>
+        </w:rPr>
         <w:t>1.2 架构状态</w:t>
       </w:r>
     </w:p>
     <w:p>
-      <w:r>
+      <w:pPr>
+        <w:spacing w:after="100" w:line="360" w:lineRule="auto"/>
+        <w:ind w:firstLine="475"/>
+      </w:pPr>
+      <w:r>
+        <w:rPr>
+          <w:rFonts w:eastAsia="宋体"/>
+          <w:color w:val="000000"/>
+          <w:sz w:val="24"/>
+          <w:szCs w:val="24"/>
+        </w:rPr>
         <w:t>ARC-A（模块化单体、端口适配与持久化异步任务）仅为当前候选；最终拆分粒度、异步一致性和部署编排仍须由后续 ADR 及人工决策确认。</w:t>
       </w:r>
     </w:p>
     <w:p>
       <w:pPr>
         <w:pStyle w:val="1"/>
-      </w:pPr>
-      <w:r>
+        <w:spacing w:before="240" w:after="160"/>
+      </w:pPr>
+      <w:r>
+        <w:rPr>
+          <w:rFonts w:eastAsia="黑体"/>
+          <w:b/>
+          <w:bCs/>
+        </w:rPr>
         <w:t>2 技术架构</w:t>
       </w:r>
     </w:p>
     <w:p>
-      <w:r>
+      <w:pPr>
+        <w:spacing w:after="100" w:line="360" w:lineRule="auto"/>
+        <w:ind w:firstLine="475"/>
+      </w:pPr>
+      <w:r>
+        <w:rPr>
+          <w:rFonts w:eastAsia="宋体"/>
+          <w:color w:val="000000"/>
+          <w:sz w:val="24"/>
+          <w:szCs w:val="24"/>
+        </w:rPr>
         <w:t>整体分层关系见表 2-1。渠道经统一 API 边界调用领域模块；领域模块拥有业务规则和写入责任，外部平台只经独立适配端口访问。</w:t>
       </w:r>
     </w:p>
     <w:tbl>
       <w:tblPr>
-        <w:tblW w:type="auto" w:w="0"/>
-        <w:tblLook w:firstColumn="1" w:firstRow="1" w:lastColumn="0" w:lastRow="0" w:noHBand="0" w:noVBand="1" w:val="04A0"/>
+        <w:tblW w:w="5000" w:type="pct"/>
+        <w:tblBorders>
+          <w:top w:val="single" w:sz="2" w:space="0" w:color="8A9BA8"/>
+          <w:left w:val="single" w:sz="2" w:space="0" w:color="8A9BA8"/>
+          <w:bottom w:val="single" w:sz="2" w:space="0" w:color="8A9BA8"/>
+          <w:right w:val="single" w:sz="2" w:space="0" w:color="8A9BA8"/>
+          <w:insideH w:val="single" w:sz="2" w:space="0" w:color="8A9BA8"/>
+          <w:insideV w:val="single" w:sz="2" w:space="0" w:color="8A9BA8"/>
+        </w:tblBorders>
+        <w:tblCellMar>
+          <w:left w:w="10" w:type="dxa"/>
+          <w:right w:w="10" w:type="dxa"/>
+        </w:tblCellMar>
+        <w:tblLook w:val="04A0" w:firstRow="1" w:lastRow="0" w:firstColumn="1" w:lastColumn="0" w:noHBand="0" w:noVBand="1"/>
       </w:tblPr>
       <w:tblGrid>
         <w:gridCol w:w="4513"/>
@@ -249,7 +469,17 @@
             <w:tcW w:type="dxa" w:w="4513"/>
           </w:tcPr>
           <w:p>
-            <w:r>
+            <w:pPr>
+              <w:spacing w:after="100" w:line="360" w:lineRule="auto"/>
+              <w:ind w:firstLine="475"/>
+            </w:pPr>
+            <w:r>
+              <w:rPr>
+                <w:rFonts w:eastAsia="宋体"/>
+                <w:color w:val="000000"/>
+                <w:sz w:val="24"/>
+                <w:szCs w:val="24"/>
+              </w:rPr>
               <w:t>层次</w:t>
             </w:r>
           </w:p>
@@ -259,7 +489,17 @@
             <w:tcW w:type="dxa" w:w="4513"/>
           </w:tcPr>
           <w:p>
-            <w:r>
+            <w:pPr>
+              <w:spacing w:after="100" w:line="360" w:lineRule="auto"/>
+              <w:ind w:firstLine="475"/>
+            </w:pPr>
+            <w:r>
+              <w:rPr>
+                <w:rFonts w:eastAsia="宋体"/>
+                <w:color w:val="000000"/>
+                <w:sz w:val="24"/>
+                <w:szCs w:val="24"/>
+              </w:rPr>
               <w:t>设计元素</w:t>
             </w:r>
           </w:p>
@@ -271,7 +511,17 @@
             <w:tcW w:type="dxa" w:w="4513"/>
           </w:tcPr>
           <w:p>
-            <w:r>
+            <w:pPr>
+              <w:spacing w:after="100" w:line="360" w:lineRule="auto"/>
+              <w:ind w:firstLine="475"/>
+            </w:pPr>
+            <w:r>
+              <w:rPr>
+                <w:rFonts w:eastAsia="宋体"/>
+                <w:color w:val="000000"/>
+                <w:sz w:val="24"/>
+                <w:szCs w:val="24"/>
+              </w:rPr>
               <w:t>渠道层</w:t>
             </w:r>
           </w:p>
@@ -281,7 +531,17 @@
             <w:tcW w:type="dxa" w:w="4513"/>
           </w:tcPr>
           <w:p>
-            <w:r>
+            <w:pPr>
+              <w:spacing w:after="100" w:line="360" w:lineRule="auto"/>
+              <w:ind w:firstLine="475"/>
+            </w:pPr>
+            <w:r>
+              <w:rPr>
+                <w:rFonts w:eastAsia="宋体"/>
+                <w:color w:val="000000"/>
+                <w:sz w:val="24"/>
+                <w:szCs w:val="24"/>
+              </w:rPr>
               <w:t>Web、大屏、H5；均经统一 API</w:t>
             </w:r>
           </w:p>
@@ -293,7 +553,17 @@
             <w:tcW w:type="dxa" w:w="4513"/>
           </w:tcPr>
           <w:p>
-            <w:r>
+            <w:pPr>
+              <w:spacing w:after="100" w:line="360" w:lineRule="auto"/>
+              <w:ind w:firstLine="475"/>
+            </w:pPr>
+            <w:r>
+              <w:rPr>
+                <w:rFonts w:eastAsia="宋体"/>
+                <w:color w:val="000000"/>
+                <w:sz w:val="24"/>
+                <w:szCs w:val="24"/>
+              </w:rPr>
               <w:t>业务层</w:t>
             </w:r>
           </w:p>
@@ -303,7 +573,17 @@
             <w:tcW w:type="dxa" w:w="4513"/>
           </w:tcPr>
           <w:p>
-            <w:r>
+            <w:pPr>
+              <w:spacing w:after="100" w:line="360" w:lineRule="auto"/>
+              <w:ind w:firstLine="475"/>
+            </w:pPr>
+            <w:r>
+              <w:rPr>
+                <w:rFonts w:eastAsia="宋体"/>
+                <w:color w:val="000000"/>
+                <w:sz w:val="24"/>
+                <w:szCs w:val="24"/>
+              </w:rPr>
               <w:t>MOD-PLAN、EVENT、TASK、RESOURCE、DUTY、DRILL、KNOWLEDGE</w:t>
             </w:r>
           </w:p>
@@ -315,7 +595,17 @@
             <w:tcW w:type="dxa" w:w="4513"/>
           </w:tcPr>
           <w:p>
-            <w:r>
+            <w:pPr>
+              <w:spacing w:after="100" w:line="360" w:lineRule="auto"/>
+              <w:ind w:firstLine="475"/>
+            </w:pPr>
+            <w:r>
+              <w:rPr>
+                <w:rFonts w:eastAsia="宋体"/>
+                <w:color w:val="000000"/>
+                <w:sz w:val="24"/>
+                <w:szCs w:val="24"/>
+              </w:rPr>
               <w:t>投影与适配层</w:t>
             </w:r>
           </w:p>
@@ -325,7 +615,17 @@
             <w:tcW w:type="dxa" w:w="4513"/>
           </w:tcPr>
           <w:p>
-            <w:r>
+            <w:pPr>
+              <w:spacing w:after="100" w:line="360" w:lineRule="auto"/>
+              <w:ind w:firstLine="475"/>
+            </w:pPr>
+            <w:r>
+              <w:rPr>
+                <w:rFonts w:eastAsia="宋体"/>
+                <w:color w:val="000000"/>
+                <w:sz w:val="24"/>
+                <w:szCs w:val="24"/>
+              </w:rPr>
               <w:t>MOD-SITUATION 只读投影；MOD-INTEGRATION 独立外部端口</w:t>
             </w:r>
           </w:p>
@@ -337,7 +637,17 @@
             <w:tcW w:type="dxa" w:w="4513"/>
           </w:tcPr>
           <w:p>
-            <w:r>
+            <w:pPr>
+              <w:spacing w:after="100" w:line="360" w:lineRule="auto"/>
+              <w:ind w:firstLine="475"/>
+            </w:pPr>
+            <w:r>
+              <w:rPr>
+                <w:rFonts w:eastAsia="宋体"/>
+                <w:color w:val="000000"/>
+                <w:sz w:val="24"/>
+                <w:szCs w:val="24"/>
+              </w:rPr>
               <w:t>公共能力层</w:t>
             </w:r>
           </w:p>
@@ -347,7 +657,17 @@
             <w:tcW w:type="dxa" w:w="4513"/>
           </w:tcPr>
           <w:p>
-            <w:r>
+            <w:pPr>
+              <w:spacing w:after="100" w:line="360" w:lineRule="auto"/>
+              <w:ind w:firstLine="475"/>
+            </w:pPr>
+            <w:r>
+              <w:rPr>
+                <w:rFonts w:eastAsia="宋体"/>
+                <w:color w:val="000000"/>
+                <w:sz w:val="24"/>
+                <w:szCs w:val="24"/>
+              </w:rPr>
               <w:t>MOD-PLATFORM：鉴权上下文、traceId、审计、幂等、错误、健康检查</w:t>
             </w:r>
           </w:p>
@@ -359,21 +679,47 @@
         <w:jc w:val="center"/>
       </w:pPr>
       <w:r>
+        <w:rPr>
+          <w:rFonts w:eastAsia="宋体"/>
+          <w:b/>
+          <w:color w:val="000000"/>
+          <w:sz w:val="18"/>
+        </w:rPr>
         <w:t>表 2-1 逻辑技术架构分层</w:t>
       </w:r>
     </w:p>
     <w:p>
       <w:pPr>
         <w:pStyle w:val="2"/>
-      </w:pPr>
-      <w:r>
+        <w:spacing w:before="240" w:after="160"/>
+      </w:pPr>
+      <w:r>
+        <w:rPr>
+          <w:rFonts w:eastAsia="黑体"/>
+          <w:b/>
+          <w:bCs/>
+          <w:sz w:val="28"/>
+          <w:szCs w:val="28"/>
+        </w:rPr>
         <w:t>2.1 模块职责与依赖</w:t>
       </w:r>
     </w:p>
     <w:tbl>
       <w:tblPr>
-        <w:tblW w:type="auto" w:w="0"/>
-        <w:tblLook w:firstColumn="1" w:firstRow="1" w:lastColumn="0" w:lastRow="0" w:noHBand="0" w:noVBand="1" w:val="04A0"/>
+        <w:tblW w:w="5000" w:type="pct"/>
+        <w:tblBorders>
+          <w:top w:val="single" w:sz="2" w:space="0" w:color="8A9BA8"/>
+          <w:left w:val="single" w:sz="2" w:space="0" w:color="8A9BA8"/>
+          <w:bottom w:val="single" w:sz="2" w:space="0" w:color="8A9BA8"/>
+          <w:right w:val="single" w:sz="2" w:space="0" w:color="8A9BA8"/>
+          <w:insideH w:val="single" w:sz="2" w:space="0" w:color="8A9BA8"/>
+          <w:insideV w:val="single" w:sz="2" w:space="0" w:color="8A9BA8"/>
+        </w:tblBorders>
+        <w:tblCellMar>
+          <w:left w:w="10" w:type="dxa"/>
+          <w:right w:w="10" w:type="dxa"/>
+        </w:tblCellMar>
+        <w:tblLook w:val="04A0" w:firstRow="1" w:lastRow="0" w:firstColumn="1" w:lastColumn="0" w:noHBand="0" w:noVBand="1"/>
       </w:tblPr>
       <w:tblGrid>
         <w:gridCol w:w="4513"/>
@@ -385,7 +731,17 @@
             <w:tcW w:type="dxa" w:w="4513"/>
           </w:tcPr>
           <w:p>
-            <w:r>
+            <w:pPr>
+              <w:spacing w:after="100" w:line="360" w:lineRule="auto"/>
+              <w:ind w:firstLine="475"/>
+            </w:pPr>
+            <w:r>
+              <w:rPr>
+                <w:rFonts w:eastAsia="宋体"/>
+                <w:color w:val="000000"/>
+                <w:sz w:val="24"/>
+                <w:szCs w:val="24"/>
+              </w:rPr>
               <w:t>模块</w:t>
             </w:r>
           </w:p>
@@ -395,7 +751,17 @@
             <w:tcW w:type="dxa" w:w="4513"/>
           </w:tcPr>
           <w:p>
-            <w:r>
+            <w:pPr>
+              <w:spacing w:after="100" w:line="360" w:lineRule="auto"/>
+              <w:ind w:firstLine="475"/>
+            </w:pPr>
+            <w:r>
+              <w:rPr>
+                <w:rFonts w:eastAsia="宋体"/>
+                <w:color w:val="000000"/>
+                <w:sz w:val="24"/>
+                <w:szCs w:val="24"/>
+              </w:rPr>
               <w:t>主责与依赖</w:t>
             </w:r>
           </w:p>
@@ -407,7 +773,17 @@
             <w:tcW w:type="dxa" w:w="4513"/>
           </w:tcPr>
           <w:p>
-            <w:r>
+            <w:pPr>
+              <w:spacing w:after="100" w:line="360" w:lineRule="auto"/>
+              <w:ind w:firstLine="475"/>
+            </w:pPr>
+            <w:r>
+              <w:rPr>
+                <w:rFonts w:eastAsia="宋体"/>
+                <w:color w:val="000000"/>
+                <w:sz w:val="24"/>
+                <w:szCs w:val="24"/>
+              </w:rPr>
               <w:t>MOD-PLAN</w:t>
             </w:r>
           </w:p>
@@ -417,7 +793,17 @@
             <w:tcW w:type="dxa" w:w="4513"/>
           </w:tcPr>
           <w:p>
-            <w:r>
+            <w:pPr>
+              <w:spacing w:after="100" w:line="360" w:lineRule="auto"/>
+              <w:ind w:firstLine="475"/>
+            </w:pPr>
+            <w:r>
+              <w:rPr>
+                <w:rFonts w:eastAsia="宋体"/>
+                <w:color w:val="000000"/>
+                <w:sz w:val="24"/>
+                <w:szCs w:val="24"/>
+              </w:rPr>
               <w:t>预案、版本、流程/任务模板；依赖中台工作流与文件</w:t>
             </w:r>
           </w:p>
@@ -429,7 +815,17 @@
             <w:tcW w:type="dxa" w:w="4513"/>
           </w:tcPr>
           <w:p>
-            <w:r>
+            <w:pPr>
+              <w:spacing w:after="100" w:line="360" w:lineRule="auto"/>
+              <w:ind w:firstLine="475"/>
+            </w:pPr>
+            <w:r>
+              <w:rPr>
+                <w:rFonts w:eastAsia="宋体"/>
+                <w:color w:val="000000"/>
+                <w:sz w:val="24"/>
+                <w:szCs w:val="24"/>
+              </w:rPr>
               <w:t>MOD-EVENT</w:t>
             </w:r>
           </w:p>
@@ -439,7 +835,17 @@
             <w:tcW w:type="dxa" w:w="4513"/>
           </w:tcPr>
           <w:p>
-            <w:r>
+            <w:pPr>
+              <w:spacing w:after="100" w:line="360" w:lineRule="auto"/>
+              <w:ind w:firstLine="475"/>
+            </w:pPr>
+            <w:r>
+              <w:rPr>
+                <w:rFonts w:eastAsia="宋体"/>
+                <w:color w:val="000000"/>
+                <w:sz w:val="24"/>
+                <w:szCs w:val="24"/>
+              </w:rPr>
               <w:t>事件、续报、核实、关闭；依赖预案、任务、IoT</w:t>
             </w:r>
           </w:p>
@@ -451,7 +857,17 @@
             <w:tcW w:type="dxa" w:w="4513"/>
           </w:tcPr>
           <w:p>
-            <w:r>
+            <w:pPr>
+              <w:spacing w:after="100" w:line="360" w:lineRule="auto"/>
+              <w:ind w:firstLine="475"/>
+            </w:pPr>
+            <w:r>
+              <w:rPr>
+                <w:rFonts w:eastAsia="宋体"/>
+                <w:color w:val="000000"/>
+                <w:sz w:val="24"/>
+                <w:szCs w:val="24"/>
+              </w:rPr>
               <w:t>MOD-TASK</w:t>
             </w:r>
           </w:p>
@@ -461,7 +877,17 @@
             <w:tcW w:type="dxa" w:w="4513"/>
           </w:tcPr>
           <w:p>
-            <w:r>
+            <w:pPr>
+              <w:spacing w:after="100" w:line="360" w:lineRule="auto"/>
+              <w:ind w:firstLine="475"/>
+            </w:pPr>
+            <w:r>
+              <w:rPr>
+                <w:rFonts w:eastAsia="宋体"/>
+                <w:color w:val="000000"/>
+                <w:sz w:val="24"/>
+                <w:szCs w:val="24"/>
+              </w:rPr>
               <w:t>任务快照、派发、反馈、回执补偿；依赖消息与组织权限</w:t>
             </w:r>
           </w:p>
@@ -473,7 +899,17 @@
             <w:tcW w:type="dxa" w:w="4513"/>
           </w:tcPr>
           <w:p>
-            <w:r>
+            <w:pPr>
+              <w:spacing w:after="100" w:line="360" w:lineRule="auto"/>
+              <w:ind w:firstLine="475"/>
+            </w:pPr>
+            <w:r>
+              <w:rPr>
+                <w:rFonts w:eastAsia="宋体"/>
+                <w:color w:val="000000"/>
+                <w:sz w:val="24"/>
+                <w:szCs w:val="24"/>
+              </w:rPr>
               <w:t>MOD-SITUATION</w:t>
             </w:r>
           </w:p>
@@ -483,7 +919,17 @@
             <w:tcW w:type="dxa" w:w="4513"/>
           </w:tcPr>
           <w:p>
-            <w:r>
+            <w:pPr>
+              <w:spacing w:after="100" w:line="360" w:lineRule="auto"/>
+              <w:ind w:firstLine="475"/>
+            </w:pPr>
+            <w:r>
+              <w:rPr>
+                <w:rFonts w:eastAsia="宋体"/>
+                <w:color w:val="000000"/>
+                <w:sz w:val="24"/>
+                <w:szCs w:val="24"/>
+              </w:rPr>
               <w:t>可重建态势读投影；依赖事件、资源、任务及地图/视频</w:t>
             </w:r>
           </w:p>
@@ -495,7 +941,17 @@
             <w:tcW w:type="dxa" w:w="4513"/>
           </w:tcPr>
           <w:p>
-            <w:r>
+            <w:pPr>
+              <w:spacing w:after="100" w:line="360" w:lineRule="auto"/>
+              <w:ind w:firstLine="475"/>
+            </w:pPr>
+            <w:r>
+              <w:rPr>
+                <w:rFonts w:eastAsia="宋体"/>
+                <w:color w:val="000000"/>
+                <w:sz w:val="24"/>
+                <w:szCs w:val="24"/>
+              </w:rPr>
               <w:t>MOD-RESOURCE</w:t>
             </w:r>
           </w:p>
@@ -505,7 +961,17 @@
             <w:tcW w:type="dxa" w:w="4513"/>
           </w:tcPr>
           <w:p>
-            <w:r>
+            <w:pPr>
+              <w:spacing w:after="100" w:line="360" w:lineRule="auto"/>
+              <w:ind w:firstLine="475"/>
+            </w:pPr>
+            <w:r>
+              <w:rPr>
+                <w:rFonts w:eastAsia="宋体"/>
+                <w:color w:val="000000"/>
+                <w:sz w:val="24"/>
+                <w:szCs w:val="24"/>
+              </w:rPr>
               <w:t>人员、物资、盘点快照/差异；依赖地图、组织、文件</w:t>
             </w:r>
           </w:p>
@@ -517,7 +983,17 @@
             <w:tcW w:type="dxa" w:w="4513"/>
           </w:tcPr>
           <w:p>
-            <w:r>
+            <w:pPr>
+              <w:spacing w:after="100" w:line="360" w:lineRule="auto"/>
+              <w:ind w:firstLine="475"/>
+            </w:pPr>
+            <w:r>
+              <w:rPr>
+                <w:rFonts w:eastAsia="宋体"/>
+                <w:color w:val="000000"/>
+                <w:sz w:val="24"/>
+                <w:szCs w:val="24"/>
+              </w:rPr>
               <w:t>MOD-DUTY / MOD-DRILL / MOD-KNOWLEDGE</w:t>
             </w:r>
           </w:p>
@@ -527,7 +1003,17 @@
             <w:tcW w:type="dxa" w:w="4513"/>
           </w:tcPr>
           <w:p>
-            <w:r>
+            <w:pPr>
+              <w:spacing w:after="100" w:line="360" w:lineRule="auto"/>
+              <w:ind w:firstLine="475"/>
+            </w:pPr>
+            <w:r>
+              <w:rPr>
+                <w:rFonts w:eastAsia="宋体"/>
+                <w:color w:val="000000"/>
+                <w:sz w:val="24"/>
+                <w:szCs w:val="24"/>
+              </w:rPr>
               <w:t>值班打卡、演练评估、知识检索；分别依赖地图/消息/文件</w:t>
             </w:r>
           </w:p>
@@ -539,7 +1025,17 @@
             <w:tcW w:type="dxa" w:w="4513"/>
           </w:tcPr>
           <w:p>
-            <w:r>
+            <w:pPr>
+              <w:spacing w:after="100" w:line="360" w:lineRule="auto"/>
+              <w:ind w:firstLine="475"/>
+            </w:pPr>
+            <w:r>
+              <w:rPr>
+                <w:rFonts w:eastAsia="宋体"/>
+                <w:color w:val="000000"/>
+                <w:sz w:val="24"/>
+                <w:szCs w:val="24"/>
+              </w:rPr>
               <w:t>MOD-MOBILE / MOD-INTEGRATION / MOD-PLATFORM</w:t>
             </w:r>
           </w:p>
@@ -549,7 +1045,17 @@
             <w:tcW w:type="dxa" w:w="4513"/>
           </w:tcPr>
           <w:p>
-            <w:r>
+            <w:pPr>
+              <w:spacing w:after="100" w:line="360" w:lineRule="auto"/>
+              <w:ind w:firstLine="475"/>
+            </w:pPr>
+            <w:r>
+              <w:rPr>
+                <w:rFonts w:eastAsia="宋体"/>
+                <w:color w:val="000000"/>
+                <w:sz w:val="24"/>
+                <w:szCs w:val="24"/>
+              </w:rPr>
               <w:t>H5 渠道、外部适配、统一 API/审计/幂等/健康检查</w:t>
             </w:r>
           </w:p>
@@ -561,39 +1067,89 @@
         <w:jc w:val="center"/>
       </w:pPr>
       <w:r>
+        <w:rPr>
+          <w:rFonts w:eastAsia="宋体"/>
+          <w:b/>
+          <w:color w:val="000000"/>
+          <w:sz w:val="18"/>
+        </w:rPr>
         <w:t>表 2-2 模块职责与依赖</w:t>
       </w:r>
     </w:p>
     <w:p>
       <w:pPr>
         <w:pStyle w:val="1"/>
-      </w:pPr>
-      <w:r>
+        <w:spacing w:before="240" w:after="160"/>
+      </w:pPr>
+      <w:r>
+        <w:rPr>
+          <w:rFonts w:eastAsia="黑体"/>
+          <w:b/>
+          <w:bCs/>
+        </w:rPr>
         <w:t>3 数据架构</w:t>
       </w:r>
     </w:p>
     <w:p>
-      <w:r>
+      <w:pPr>
+        <w:spacing w:after="100" w:line="360" w:lineRule="auto"/>
+        <w:ind w:firstLine="475"/>
+      </w:pPr>
+      <w:r>
+        <w:rPr>
+          <w:rFonts w:eastAsia="宋体"/>
+          <w:color w:val="000000"/>
+          <w:sz w:val="24"/>
+          <w:szCs w:val="24"/>
+        </w:rPr>
         <w:t>数据按领域模块唯一写入。事件、任务、资源、值班、演练、知识及审计保留业务编号、外部标识、traceId 和多时间语义。MOD-SITUATION 仅维护可重建投影，不能反向成为事实源。物理模型留待 G3-04。</w:t>
       </w:r>
     </w:p>
     <w:p>
       <w:pPr>
         <w:pStyle w:val="1"/>
-      </w:pPr>
-      <w:r>
+        <w:spacing w:before="240" w:after="160"/>
+      </w:pPr>
+      <w:r>
+        <w:rPr>
+          <w:rFonts w:eastAsia="黑体"/>
+          <w:b/>
+          <w:bCs/>
+        </w:rPr>
         <w:t>4 部署架构与故障域</w:t>
       </w:r>
     </w:p>
     <w:p>
-      <w:r>
+      <w:pPr>
+        <w:spacing w:after="100" w:line="360" w:lineRule="auto"/>
+        <w:ind w:firstLine="475"/>
+      </w:pPr>
+      <w:r>
+        <w:rPr>
+          <w:rFonts w:eastAsia="宋体"/>
+          <w:color w:val="000000"/>
+          <w:sz w:val="24"/>
+          <w:szCs w:val="24"/>
+        </w:rPr>
         <w:t>系统部署于甲方内部环境，采用容器制品、配置外置和受控日志。渠道/API、领域业务、外部适配、数据和可观测性为逻辑故障域。建议配置 KN-070—078 尚待容量、网络、存储和恢复验证。</w:t>
       </w:r>
     </w:p>
     <w:tbl>
       <w:tblPr>
-        <w:tblW w:type="auto" w:w="0"/>
-        <w:tblLook w:firstColumn="1" w:firstRow="1" w:lastColumn="0" w:lastRow="0" w:noHBand="0" w:noVBand="1" w:val="04A0"/>
+        <w:tblW w:w="5000" w:type="pct"/>
+        <w:tblBorders>
+          <w:top w:val="single" w:sz="2" w:space="0" w:color="8A9BA8"/>
+          <w:left w:val="single" w:sz="2" w:space="0" w:color="8A9BA8"/>
+          <w:bottom w:val="single" w:sz="2" w:space="0" w:color="8A9BA8"/>
+          <w:right w:val="single" w:sz="2" w:space="0" w:color="8A9BA8"/>
+          <w:insideH w:val="single" w:sz="2" w:space="0" w:color="8A9BA8"/>
+          <w:insideV w:val="single" w:sz="2" w:space="0" w:color="8A9BA8"/>
+        </w:tblBorders>
+        <w:tblCellMar>
+          <w:left w:w="10" w:type="dxa"/>
+          <w:right w:w="10" w:type="dxa"/>
+        </w:tblCellMar>
+        <w:tblLook w:val="04A0" w:firstRow="1" w:lastRow="0" w:firstColumn="1" w:lastColumn="0" w:noHBand="0" w:noVBand="1"/>
       </w:tblPr>
       <w:tblGrid>
         <w:gridCol w:w="4513"/>
@@ -605,7 +1161,17 @@
             <w:tcW w:type="dxa" w:w="4513"/>
           </w:tcPr>
           <w:p>
-            <w:r>
+            <w:pPr>
+              <w:spacing w:after="100" w:line="360" w:lineRule="auto"/>
+              <w:ind w:firstLine="475"/>
+            </w:pPr>
+            <w:r>
+              <w:rPr>
+                <w:rFonts w:eastAsia="宋体"/>
+                <w:color w:val="000000"/>
+                <w:sz w:val="24"/>
+                <w:szCs w:val="24"/>
+              </w:rPr>
               <w:t>故障域</w:t>
             </w:r>
           </w:p>
@@ -615,7 +1181,17 @@
             <w:tcW w:type="dxa" w:w="4513"/>
           </w:tcPr>
           <w:p>
-            <w:r>
+            <w:pPr>
+              <w:spacing w:after="100" w:line="360" w:lineRule="auto"/>
+              <w:ind w:firstLine="475"/>
+            </w:pPr>
+            <w:r>
+              <w:rPr>
+                <w:rFonts w:eastAsia="宋体"/>
+                <w:color w:val="000000"/>
+                <w:sz w:val="24"/>
+                <w:szCs w:val="24"/>
+              </w:rPr>
               <w:t>隔离与恢复约束</w:t>
             </w:r>
           </w:p>
@@ -627,7 +1203,17 @@
             <w:tcW w:type="dxa" w:w="4513"/>
           </w:tcPr>
           <w:p>
-            <w:r>
+            <w:pPr>
+              <w:spacing w:after="100" w:line="360" w:lineRule="auto"/>
+              <w:ind w:firstLine="475"/>
+            </w:pPr>
+            <w:r>
+              <w:rPr>
+                <w:rFonts w:eastAsia="宋体"/>
+                <w:color w:val="000000"/>
+                <w:sz w:val="24"/>
+                <w:szCs w:val="24"/>
+              </w:rPr>
               <w:t>外部适配</w:t>
             </w:r>
           </w:p>
@@ -637,7 +1223,17 @@
             <w:tcW w:type="dxa" w:w="4513"/>
           </w:tcPr>
           <w:p>
-            <w:r>
+            <w:pPr>
+              <w:spacing w:after="100" w:line="360" w:lineRule="auto"/>
+              <w:ind w:firstLine="475"/>
+            </w:pPr>
+            <w:r>
+              <w:rPr>
+                <w:rFonts w:eastAsia="宋体"/>
+                <w:color w:val="000000"/>
+                <w:sz w:val="24"/>
+                <w:szCs w:val="24"/>
+              </w:rPr>
               <w:t>超时/失败不回滚已提交业务；有限重试、审计和人工降级</w:t>
             </w:r>
           </w:p>
@@ -649,7 +1245,17 @@
             <w:tcW w:type="dxa" w:w="4513"/>
           </w:tcPr>
           <w:p>
-            <w:r>
+            <w:pPr>
+              <w:spacing w:after="100" w:line="360" w:lineRule="auto"/>
+              <w:ind w:firstLine="475"/>
+            </w:pPr>
+            <w:r>
+              <w:rPr>
+                <w:rFonts w:eastAsia="宋体"/>
+                <w:color w:val="000000"/>
+                <w:sz w:val="24"/>
+                <w:szCs w:val="24"/>
+              </w:rPr>
               <w:t>领域业务</w:t>
             </w:r>
           </w:p>
@@ -659,7 +1265,17 @@
             <w:tcW w:type="dxa" w:w="4513"/>
           </w:tcPr>
           <w:p>
-            <w:r>
+            <w:pPr>
+              <w:spacing w:after="100" w:line="360" w:lineRule="auto"/>
+              <w:ind w:firstLine="475"/>
+            </w:pPr>
+            <w:r>
+              <w:rPr>
+                <w:rFonts w:eastAsia="宋体"/>
+                <w:color w:val="000000"/>
+                <w:sz w:val="24"/>
+                <w:szCs w:val="24"/>
+              </w:rPr>
               <w:t>先持久化业务状态，再派生通知、外部调用和读投影</w:t>
             </w:r>
           </w:p>
@@ -671,7 +1287,17 @@
             <w:tcW w:type="dxa" w:w="4513"/>
           </w:tcPr>
           <w:p>
-            <w:r>
+            <w:pPr>
+              <w:spacing w:after="100" w:line="360" w:lineRule="auto"/>
+              <w:ind w:firstLine="475"/>
+            </w:pPr>
+            <w:r>
+              <w:rPr>
+                <w:rFonts w:eastAsia="宋体"/>
+                <w:color w:val="000000"/>
+                <w:sz w:val="24"/>
+                <w:szCs w:val="24"/>
+              </w:rPr>
               <w:t>控制调用</w:t>
             </w:r>
           </w:p>
@@ -681,7 +1307,17 @@
             <w:tcW w:type="dxa" w:w="4513"/>
           </w:tcPr>
           <w:p>
-            <w:r>
+            <w:pPr>
+              <w:spacing w:after="100" w:line="360" w:lineRule="auto"/>
+              <w:ind w:firstLine="475"/>
+            </w:pPr>
+            <w:r>
+              <w:rPr>
+                <w:rFonts w:eastAsia="宋体"/>
+                <w:color w:val="000000"/>
+                <w:sz w:val="24"/>
+                <w:szCs w:val="24"/>
+              </w:rPr>
               <w:t>授权、二次确认、单次下发、回执对账；不自动重放</w:t>
             </w:r>
           </w:p>
@@ -693,7 +1329,17 @@
             <w:tcW w:type="dxa" w:w="4513"/>
           </w:tcPr>
           <w:p>
-            <w:r>
+            <w:pPr>
+              <w:spacing w:after="100" w:line="360" w:lineRule="auto"/>
+              <w:ind w:firstLine="475"/>
+            </w:pPr>
+            <w:r>
+              <w:rPr>
+                <w:rFonts w:eastAsia="宋体"/>
+                <w:color w:val="000000"/>
+                <w:sz w:val="24"/>
+                <w:szCs w:val="24"/>
+              </w:rPr>
               <w:t>数据与可观测性</w:t>
             </w:r>
           </w:p>
@@ -703,7 +1349,17 @@
             <w:tcW w:type="dxa" w:w="4513"/>
           </w:tcPr>
           <w:p>
-            <w:r>
+            <w:pPr>
+              <w:spacing w:after="100" w:line="360" w:lineRule="auto"/>
+              <w:ind w:firstLine="475"/>
+            </w:pPr>
+            <w:r>
+              <w:rPr>
+                <w:rFonts w:eastAsia="宋体"/>
+                <w:color w:val="000000"/>
+                <w:sz w:val="24"/>
+                <w:szCs w:val="24"/>
+              </w:rPr>
               <w:t>健康检查、关联日志、备份恢复演练和干净环境部署作为后续验证输入</w:t>
             </w:r>
           </w:p>
@@ -715,31 +1371,75 @@
         <w:jc w:val="center"/>
       </w:pPr>
       <w:r>
+        <w:rPr>
+          <w:rFonts w:eastAsia="宋体"/>
+          <w:b/>
+          <w:color w:val="000000"/>
+          <w:sz w:val="18"/>
+        </w:rPr>
         <w:t>表 4-1 部署故障域与恢复约束</w:t>
       </w:r>
     </w:p>
     <w:p>
       <w:pPr>
         <w:pStyle w:val="1"/>
-      </w:pPr>
-      <w:r>
+        <w:spacing w:before="240" w:after="160"/>
+      </w:pPr>
+      <w:r>
+        <w:rPr>
+          <w:rFonts w:eastAsia="黑体"/>
+          <w:b/>
+          <w:bCs/>
+        </w:rPr>
         <w:t>5 外部边界与主要 NFR</w:t>
       </w:r>
     </w:p>
     <w:p>
-      <w:r>
+      <w:pPr>
+        <w:spacing w:after="100" w:line="360" w:lineRule="auto"/>
+        <w:ind w:firstLine="475"/>
+      </w:pPr>
+      <w:r>
+        <w:rPr>
+          <w:rFonts w:eastAsia="宋体"/>
+          <w:color w:val="000000"/>
+          <w:sz w:val="24"/>
+          <w:szCs w:val="24"/>
+        </w:rPr>
         <w:t>EXT-VIDEO、EXT-PUBLISH、EXT-INTRUSION、EXT-ACCESS、EXT-FIRE、EXT-IOT、EXT-MIDDLE、EXT-MESSAGE 保持独立语义。甲方提供既有能力、账号、协议和测试环境；本系统负责业务适配、关联、审计和失败处理。</w:t>
       </w:r>
     </w:p>
     <w:p>
-      <w:r>
+      <w:pPr>
+        <w:spacing w:after="100" w:line="360" w:lineRule="auto"/>
+        <w:ind w:firstLine="475"/>
+      </w:pPr>
+      <w:r>
+        <w:rPr>
+          <w:rFonts w:eastAsia="宋体"/>
+          <w:color w:val="000000"/>
+          <w:sz w:val="24"/>
+          <w:szCs w:val="24"/>
+        </w:rPr>
         <w:t>ISSUE-G3-01-001 仍为 OPEN：视频/消息字段、认证、回执和性能未验证，接口不冻结且不得宣称连通。KN-064 以同一 traceId/eventId 验证视频、信息发布、物联网、中台的正常、无权、超时/失败联动。</w:t>
       </w:r>
     </w:p>
     <w:tbl>
       <w:tblPr>
-        <w:tblW w:type="auto" w:w="0"/>
-        <w:tblLook w:firstColumn="1" w:firstRow="1" w:lastColumn="0" w:lastRow="0" w:noHBand="0" w:noVBand="1" w:val="04A0"/>
+        <w:tblW w:w="5000" w:type="pct"/>
+        <w:tblBorders>
+          <w:top w:val="single" w:sz="2" w:space="0" w:color="8A9BA8"/>
+          <w:left w:val="single" w:sz="2" w:space="0" w:color="8A9BA8"/>
+          <w:bottom w:val="single" w:sz="2" w:space="0" w:color="8A9BA8"/>
+          <w:right w:val="single" w:sz="2" w:space="0" w:color="8A9BA8"/>
+          <w:insideH w:val="single" w:sz="2" w:space="0" w:color="8A9BA8"/>
+          <w:insideV w:val="single" w:sz="2" w:space="0" w:color="8A9BA8"/>
+        </w:tblBorders>
+        <w:tblCellMar>
+          <w:left w:w="10" w:type="dxa"/>
+          <w:right w:w="10" w:type="dxa"/>
+        </w:tblCellMar>
+        <w:tblLook w:val="04A0" w:firstRow="1" w:lastRow="0" w:firstColumn="1" w:lastColumn="0" w:noHBand="0" w:noVBand="1"/>
       </w:tblPr>
       <w:tblGrid>
         <w:gridCol w:w="4513"/>
@@ -751,7 +1451,17 @@
             <w:tcW w:type="dxa" w:w="4513"/>
           </w:tcPr>
           <w:p>
-            <w:r>
+            <w:pPr>
+              <w:spacing w:after="100" w:line="360" w:lineRule="auto"/>
+              <w:ind w:firstLine="475"/>
+            </w:pPr>
+            <w:r>
+              <w:rPr>
+                <w:rFonts w:eastAsia="宋体"/>
+                <w:color w:val="000000"/>
+                <w:sz w:val="24"/>
+                <w:szCs w:val="24"/>
+              </w:rPr>
               <w:t>设计预算</w:t>
             </w:r>
           </w:p>
@@ -761,7 +1471,17 @@
             <w:tcW w:type="dxa" w:w="4513"/>
           </w:tcPr>
           <w:p>
-            <w:r>
+            <w:pPr>
+              <w:spacing w:after="100" w:line="360" w:lineRule="auto"/>
+              <w:ind w:firstLine="475"/>
+            </w:pPr>
+            <w:r>
+              <w:rPr>
+                <w:rFonts w:eastAsia="宋体"/>
+                <w:color w:val="000000"/>
+                <w:sz w:val="24"/>
+                <w:szCs w:val="24"/>
+              </w:rPr>
               <w:t>约束（待测）</w:t>
             </w:r>
           </w:p>
@@ -773,7 +1493,17 @@
             <w:tcW w:type="dxa" w:w="4513"/>
           </w:tcPr>
           <w:p>
-            <w:r>
+            <w:pPr>
+              <w:spacing w:after="100" w:line="360" w:lineRule="auto"/>
+              <w:ind w:firstLine="475"/>
+            </w:pPr>
+            <w:r>
+              <w:rPr>
+                <w:rFonts w:eastAsia="宋体"/>
+                <w:color w:val="000000"/>
+                <w:sz w:val="24"/>
+                <w:szCs w:val="24"/>
+              </w:rPr>
               <w:t>时效</w:t>
             </w:r>
           </w:p>
@@ -783,7 +1513,17 @@
             <w:tcW w:type="dxa" w:w="4513"/>
           </w:tcPr>
           <w:p>
-            <w:r>
+            <w:pPr>
+              <w:spacing w:after="100" w:line="360" w:lineRule="auto"/>
+              <w:ind w:firstLine="475"/>
+            </w:pPr>
+            <w:r>
+              <w:rPr>
+                <w:rFonts w:eastAsia="宋体"/>
+                <w:color w:val="000000"/>
+                <w:sz w:val="24"/>
+                <w:szCs w:val="24"/>
+              </w:rPr>
               <w:t>预案下发≤3秒；告警接入≤2秒；定位≤2秒；视频首帧≤3秒</w:t>
             </w:r>
           </w:p>
@@ -795,7 +1535,17 @@
             <w:tcW w:type="dxa" w:w="4513"/>
           </w:tcPr>
           <w:p>
-            <w:r>
+            <w:pPr>
+              <w:spacing w:after="100" w:line="360" w:lineRule="auto"/>
+              <w:ind w:firstLine="475"/>
+            </w:pPr>
+            <w:r>
+              <w:rPr>
+                <w:rFonts w:eastAsia="宋体"/>
+                <w:color w:val="000000"/>
+                <w:sz w:val="24"/>
+                <w:szCs w:val="24"/>
+              </w:rPr>
               <w:t>性能容量</w:t>
             </w:r>
           </w:p>
@@ -805,7 +1555,17 @@
             <w:tcW w:type="dxa" w:w="4513"/>
           </w:tcPr>
           <w:p>
-            <w:r>
+            <w:pPr>
+              <w:spacing w:after="100" w:line="360" w:lineRule="auto"/>
+              <w:ind w:firstLine="475"/>
+            </w:pPr>
+            <w:r>
+              <w:rPr>
+                <w:rFonts w:eastAsia="宋体"/>
+                <w:color w:val="000000"/>
+                <w:sz w:val="24"/>
+                <w:szCs w:val="24"/>
+              </w:rPr>
               <w:t>95%页面≤3秒；峰值≥100人；事件/任务在线≥10年、≥2万/20万</w:t>
             </w:r>
           </w:p>
@@ -817,7 +1577,17 @@
             <w:tcW w:type="dxa" w:w="4513"/>
           </w:tcPr>
           <w:p>
-            <w:r>
+            <w:pPr>
+              <w:spacing w:after="100" w:line="360" w:lineRule="auto"/>
+              <w:ind w:firstLine="475"/>
+            </w:pPr>
+            <w:r>
+              <w:rPr>
+                <w:rFonts w:eastAsia="宋体"/>
+                <w:color w:val="000000"/>
+                <w:sz w:val="24"/>
+                <w:szCs w:val="24"/>
+              </w:rPr>
               <w:t>可靠性安全</w:t>
             </w:r>
           </w:p>
@@ -827,7 +1597,17 @@
             <w:tcW w:type="dxa" w:w="4513"/>
           </w:tcPr>
           <w:p>
-            <w:r>
+            <w:pPr>
+              <w:spacing w:after="100" w:line="360" w:lineRule="auto"/>
+              <w:ind w:firstLine="475"/>
+            </w:pPr>
+            <w:r>
+              <w:rPr>
+                <w:rFonts w:eastAsia="宋体"/>
+                <w:color w:val="000000"/>
+                <w:sz w:val="24"/>
+                <w:szCs w:val="24"/>
+              </w:rPr>
               <w:t>7×24；试运行≥99.5%；MTTR≤2小时；审计≥180天；高危漏洞0</w:t>
             </w:r>
           </w:p>
@@ -839,7 +1619,17 @@
             <w:tcW w:type="dxa" w:w="4513"/>
           </w:tcPr>
           <w:p>
-            <w:r>
+            <w:pPr>
+              <w:spacing w:after="100" w:line="360" w:lineRule="auto"/>
+              <w:ind w:firstLine="475"/>
+            </w:pPr>
+            <w:r>
+              <w:rPr>
+                <w:rFonts w:eastAsia="宋体"/>
+                <w:color w:val="000000"/>
+                <w:sz w:val="24"/>
+                <w:szCs w:val="24"/>
+              </w:rPr>
               <w:t>部署</w:t>
             </w:r>
           </w:p>
@@ -849,7 +1639,17 @@
             <w:tcW w:type="dxa" w:w="4513"/>
           </w:tcPr>
           <w:p>
-            <w:r>
+            <w:pPr>
+              <w:spacing w:after="100" w:line="360" w:lineRule="auto"/>
+              <w:ind w:firstLine="475"/>
+            </w:pPr>
+            <w:r>
+              <w:rPr>
+                <w:rFonts w:eastAsia="宋体"/>
+                <w:color w:val="000000"/>
+                <w:sz w:val="24"/>
+                <w:szCs w:val="24"/>
+              </w:rPr>
               <w:t>甲方内网私有化；干净环境一次成功且≤2小时</w:t>
             </w:r>
           </w:p>
@@ -861,21 +1661,45 @@
         <w:jc w:val="center"/>
       </w:pPr>
       <w:r>
+        <w:rPr>
+          <w:rFonts w:eastAsia="宋体"/>
+          <w:b/>
+          <w:color w:val="000000"/>
+          <w:sz w:val="18"/>
+        </w:rPr>
         <w:t>表 5-1 主要非功能设计预算</w:t>
       </w:r>
     </w:p>
     <w:p>
       <w:pPr>
         <w:pStyle w:val="1"/>
-      </w:pPr>
-      <w:r>
+        <w:spacing w:before="240" w:after="160"/>
+      </w:pPr>
+      <w:r>
+        <w:rPr>
+          <w:rFonts w:eastAsia="黑体"/>
+          <w:b/>
+          <w:bCs/>
+        </w:rPr>
         <w:t>6 需求与设计追踪</w:t>
       </w:r>
     </w:p>
     <w:tbl>
       <w:tblPr>
-        <w:tblW w:type="auto" w:w="0"/>
-        <w:tblLook w:firstColumn="1" w:firstRow="1" w:lastColumn="0" w:lastRow="0" w:noHBand="0" w:noVBand="1" w:val="04A0"/>
+        <w:tblW w:w="5000" w:type="pct"/>
+        <w:tblBorders>
+          <w:top w:val="single" w:sz="2" w:space="0" w:color="8A9BA8"/>
+          <w:left w:val="single" w:sz="2" w:space="0" w:color="8A9BA8"/>
+          <w:bottom w:val="single" w:sz="2" w:space="0" w:color="8A9BA8"/>
+          <w:right w:val="single" w:sz="2" w:space="0" w:color="8A9BA8"/>
+          <w:insideH w:val="single" w:sz="2" w:space="0" w:color="8A9BA8"/>
+          <w:insideV w:val="single" w:sz="2" w:space="0" w:color="8A9BA8"/>
+        </w:tblBorders>
+        <w:tblCellMar>
+          <w:left w:w="10" w:type="dxa"/>
+          <w:right w:w="10" w:type="dxa"/>
+        </w:tblCellMar>
+        <w:tblLook w:val="04A0" w:firstRow="1" w:lastRow="0" w:firstColumn="1" w:lastColumn="0" w:noHBand="0" w:noVBand="1"/>
       </w:tblPr>
       <w:tblGrid>
         <w:gridCol w:w="3009"/>
@@ -888,7 +1712,17 @@
             <w:tcW w:type="dxa" w:w="3009"/>
           </w:tcPr>
           <w:p>
-            <w:r>
+            <w:pPr>
+              <w:spacing w:after="100" w:line="360" w:lineRule="auto"/>
+              <w:ind w:firstLine="475"/>
+            </w:pPr>
+            <w:r>
+              <w:rPr>
+                <w:rFonts w:eastAsia="宋体"/>
+                <w:color w:val="000000"/>
+                <w:sz w:val="24"/>
+                <w:szCs w:val="24"/>
+              </w:rPr>
               <w:t>设计元素</w:t>
             </w:r>
           </w:p>
@@ -898,7 +1732,17 @@
             <w:tcW w:type="dxa" w:w="3009"/>
           </w:tcPr>
           <w:p>
-            <w:r>
+            <w:pPr>
+              <w:spacing w:after="100" w:line="360" w:lineRule="auto"/>
+              <w:ind w:firstLine="475"/>
+            </w:pPr>
+            <w:r>
+              <w:rPr>
+                <w:rFonts w:eastAsia="宋体"/>
+                <w:color w:val="000000"/>
+                <w:sz w:val="24"/>
+                <w:szCs w:val="24"/>
+              </w:rPr>
               <w:t>需求/AC 锚点</w:t>
             </w:r>
           </w:p>
@@ -908,7 +1752,17 @@
             <w:tcW w:type="dxa" w:w="3009"/>
           </w:tcPr>
           <w:p>
-            <w:r>
+            <w:pPr>
+              <w:spacing w:after="100" w:line="360" w:lineRule="auto"/>
+              <w:ind w:firstLine="475"/>
+            </w:pPr>
+            <w:r>
+              <w:rPr>
+                <w:rFonts w:eastAsia="宋体"/>
+                <w:color w:val="000000"/>
+                <w:sz w:val="24"/>
+                <w:szCs w:val="24"/>
+              </w:rPr>
               <w:t>后续挂接</w:t>
             </w:r>
           </w:p>
@@ -920,7 +1774,17 @@
             <w:tcW w:type="dxa" w:w="3009"/>
           </w:tcPr>
           <w:p>
-            <w:r>
+            <w:pPr>
+              <w:spacing w:after="100" w:line="360" w:lineRule="auto"/>
+              <w:ind w:firstLine="475"/>
+            </w:pPr>
+            <w:r>
+              <w:rPr>
+                <w:rFonts w:eastAsia="宋体"/>
+                <w:color w:val="000000"/>
+                <w:sz w:val="24"/>
+                <w:szCs w:val="24"/>
+              </w:rPr>
               <w:t>ARCH-01 统一 API 边界</w:t>
             </w:r>
           </w:p>
@@ -930,7 +1794,17 @@
             <w:tcW w:type="dxa" w:w="3009"/>
           </w:tcPr>
           <w:p>
-            <w:r>
+            <w:pPr>
+              <w:spacing w:after="100" w:line="360" w:lineRule="auto"/>
+              <w:ind w:firstLine="475"/>
+            </w:pPr>
+            <w:r>
+              <w:rPr>
+                <w:rFonts w:eastAsia="宋体"/>
+                <w:color w:val="000000"/>
+                <w:sz w:val="24"/>
+                <w:szCs w:val="24"/>
+              </w:rPr>
               <w:t>AC-G2-FR-013-01、013-03</w:t>
             </w:r>
           </w:p>
@@ -940,7 +1814,17 @@
             <w:tcW w:type="dxa" w:w="3009"/>
           </w:tcPr>
           <w:p>
-            <w:r>
+            <w:pPr>
+              <w:spacing w:after="100" w:line="360" w:lineRule="auto"/>
+              <w:ind w:firstLine="475"/>
+            </w:pPr>
+            <w:r>
+              <w:rPr>
+                <w:rFonts w:eastAsia="宋体"/>
+                <w:color w:val="000000"/>
+                <w:sz w:val="24"/>
+                <w:szCs w:val="24"/>
+              </w:rPr>
               <w:t>G3-06/G3-08</w:t>
             </w:r>
           </w:p>
@@ -952,7 +1836,17 @@
             <w:tcW w:type="dxa" w:w="3009"/>
           </w:tcPr>
           <w:p>
-            <w:r>
+            <w:pPr>
+              <w:spacing w:after="100" w:line="360" w:lineRule="auto"/>
+              <w:ind w:firstLine="475"/>
+            </w:pPr>
+            <w:r>
+              <w:rPr>
+                <w:rFonts w:eastAsia="宋体"/>
+                <w:color w:val="000000"/>
+                <w:sz w:val="24"/>
+                <w:szCs w:val="24"/>
+              </w:rPr>
               <w:t>ARCH-02 事件任务编排</w:t>
             </w:r>
           </w:p>
@@ -962,7 +1856,17 @@
             <w:tcW w:type="dxa" w:w="3009"/>
           </w:tcPr>
           <w:p>
-            <w:r>
+            <w:pPr>
+              <w:spacing w:after="100" w:line="360" w:lineRule="auto"/>
+              <w:ind w:firstLine="475"/>
+            </w:pPr>
+            <w:r>
+              <w:rPr>
+                <w:rFonts w:eastAsia="宋体"/>
+                <w:color w:val="000000"/>
+                <w:sz w:val="24"/>
+                <w:szCs w:val="24"/>
+              </w:rPr>
               <w:t>AC-G2-FR-003-01、014-01、015-01</w:t>
             </w:r>
           </w:p>
@@ -972,7 +1876,17 @@
             <w:tcW w:type="dxa" w:w="3009"/>
           </w:tcPr>
           <w:p>
-            <w:r>
+            <w:pPr>
+              <w:spacing w:after="100" w:line="360" w:lineRule="auto"/>
+              <w:ind w:firstLine="475"/>
+            </w:pPr>
+            <w:r>
+              <w:rPr>
+                <w:rFonts w:eastAsia="宋体"/>
+                <w:color w:val="000000"/>
+                <w:sz w:val="24"/>
+                <w:szCs w:val="24"/>
+              </w:rPr>
               <w:t>G3-05/G3-08</w:t>
             </w:r>
           </w:p>
@@ -984,7 +1898,17 @@
             <w:tcW w:type="dxa" w:w="3009"/>
           </w:tcPr>
           <w:p>
-            <w:r>
+            <w:pPr>
+              <w:spacing w:after="100" w:line="360" w:lineRule="auto"/>
+              <w:ind w:firstLine="475"/>
+            </w:pPr>
+            <w:r>
+              <w:rPr>
+                <w:rFonts w:eastAsia="宋体"/>
+                <w:color w:val="000000"/>
+                <w:sz w:val="24"/>
+                <w:szCs w:val="24"/>
+              </w:rPr>
               <w:t>ARCH-03 资源与快照</w:t>
             </w:r>
           </w:p>
@@ -994,7 +1918,17 @@
             <w:tcW w:type="dxa" w:w="3009"/>
           </w:tcPr>
           <w:p>
-            <w:r>
+            <w:pPr>
+              <w:spacing w:after="100" w:line="360" w:lineRule="auto"/>
+              <w:ind w:firstLine="475"/>
+            </w:pPr>
+            <w:r>
+              <w:rPr>
+                <w:rFonts w:eastAsia="宋体"/>
+                <w:color w:val="000000"/>
+                <w:sz w:val="24"/>
+                <w:szCs w:val="24"/>
+              </w:rPr>
               <w:t>AC-G2-FR-009-01、025-02</w:t>
             </w:r>
           </w:p>
@@ -1004,7 +1938,17 @@
             <w:tcW w:type="dxa" w:w="3009"/>
           </w:tcPr>
           <w:p>
-            <w:r>
+            <w:pPr>
+              <w:spacing w:after="100" w:line="360" w:lineRule="auto"/>
+              <w:ind w:firstLine="475"/>
+            </w:pPr>
+            <w:r>
+              <w:rPr>
+                <w:rFonts w:eastAsia="宋体"/>
+                <w:color w:val="000000"/>
+                <w:sz w:val="24"/>
+                <w:szCs w:val="24"/>
+              </w:rPr>
               <w:t>G3-04/G3-08</w:t>
             </w:r>
           </w:p>
@@ -1016,7 +1960,17 @@
             <w:tcW w:type="dxa" w:w="3009"/>
           </w:tcPr>
           <w:p>
-            <w:r>
+            <w:pPr>
+              <w:spacing w:after="100" w:line="360" w:lineRule="auto"/>
+              <w:ind w:firstLine="475"/>
+            </w:pPr>
+            <w:r>
+              <w:rPr>
+                <w:rFonts w:eastAsia="宋体"/>
+                <w:color w:val="000000"/>
+                <w:sz w:val="24"/>
+                <w:szCs w:val="24"/>
+              </w:rPr>
               <w:t>ARCH-04 外部端口与降级</w:t>
             </w:r>
           </w:p>
@@ -1026,7 +1980,17 @@
             <w:tcW w:type="dxa" w:w="3009"/>
           </w:tcPr>
           <w:p>
-            <w:r>
+            <w:pPr>
+              <w:spacing w:after="100" w:line="360" w:lineRule="auto"/>
+              <w:ind w:firstLine="475"/>
+            </w:pPr>
+            <w:r>
+              <w:rPr>
+                <w:rFonts w:eastAsia="宋体"/>
+                <w:color w:val="000000"/>
+                <w:sz w:val="24"/>
+                <w:szCs w:val="24"/>
+              </w:rPr>
               <w:t>AC-G2-FR-006-01、020-02、027-01、029-03</w:t>
             </w:r>
           </w:p>
@@ -1036,7 +2000,17 @@
             <w:tcW w:type="dxa" w:w="3009"/>
           </w:tcPr>
           <w:p>
-            <w:r>
+            <w:pPr>
+              <w:spacing w:after="100" w:line="360" w:lineRule="auto"/>
+              <w:ind w:firstLine="475"/>
+            </w:pPr>
+            <w:r>
+              <w:rPr>
+                <w:rFonts w:eastAsia="宋体"/>
+                <w:color w:val="000000"/>
+                <w:sz w:val="24"/>
+                <w:szCs w:val="24"/>
+              </w:rPr>
               <w:t>G3-06/G3-08</w:t>
             </w:r>
           </w:p>
@@ -1048,7 +2022,17 @@
             <w:tcW w:type="dxa" w:w="3009"/>
           </w:tcPr>
           <w:p>
-            <w:r>
+            <w:pPr>
+              <w:spacing w:after="100" w:line="360" w:lineRule="auto"/>
+              <w:ind w:firstLine="475"/>
+            </w:pPr>
+            <w:r>
+              <w:rPr>
+                <w:rFonts w:eastAsia="宋体"/>
+                <w:color w:val="000000"/>
+                <w:sz w:val="24"/>
+                <w:szCs w:val="24"/>
+              </w:rPr>
               <w:t>ARCH-05 联动与可观测性</w:t>
             </w:r>
           </w:p>
@@ -1058,7 +2042,17 @@
             <w:tcW w:type="dxa" w:w="3009"/>
           </w:tcPr>
           <w:p>
-            <w:r>
+            <w:pPr>
+              <w:spacing w:after="100" w:line="360" w:lineRule="auto"/>
+              <w:ind w:firstLine="475"/>
+            </w:pPr>
+            <w:r>
+              <w:rPr>
+                <w:rFonts w:eastAsia="宋体"/>
+                <w:color w:val="000000"/>
+                <w:sz w:val="24"/>
+                <w:szCs w:val="24"/>
+              </w:rPr>
               <w:t>AC-G2-FR-006-01、027-01；KN-064</w:t>
             </w:r>
           </w:p>
@@ -1068,7 +2062,17 @@
             <w:tcW w:type="dxa" w:w="3009"/>
           </w:tcPr>
           <w:p>
-            <w:r>
+            <w:pPr>
+              <w:spacing w:after="100" w:line="360" w:lineRule="auto"/>
+              <w:ind w:firstLine="475"/>
+            </w:pPr>
+            <w:r>
+              <w:rPr>
+                <w:rFonts w:eastAsia="宋体"/>
+                <w:color w:val="000000"/>
+                <w:sz w:val="24"/>
+                <w:szCs w:val="24"/>
+              </w:rPr>
               <w:t>G3-08/G3-09</w:t>
             </w:r>
           </w:p>
@@ -1080,24 +2084,56 @@
         <w:jc w:val="center"/>
       </w:pPr>
       <w:r>
+        <w:rPr>
+          <w:rFonts w:eastAsia="宋体"/>
+          <w:b/>
+          <w:color w:val="000000"/>
+          <w:sz w:val="18"/>
+        </w:rPr>
         <w:t>表 6-1 需求与设计元素追踪</w:t>
       </w:r>
     </w:p>
     <w:p>
-      <w:r>
+      <w:pPr>
+        <w:spacing w:after="100" w:line="360" w:lineRule="auto"/>
+        <w:ind w:firstLine="475"/>
+      </w:pPr>
+      <w:r>
+        <w:rPr>
+          <w:rFonts w:eastAsia="宋体"/>
+          <w:color w:val="000000"/>
+          <w:sz w:val="24"/>
+          <w:szCs w:val="24"/>
+        </w:rPr>
         <w:t>G3-08 将完成39条 FR、34条★FR、117条 AC 的双向设计挂接；本表不替代 RTM。</w:t>
       </w:r>
     </w:p>
     <w:p>
       <w:pPr>
         <w:pStyle w:val="1"/>
-      </w:pPr>
-      <w:r>
+        <w:spacing w:before="240" w:after="160"/>
+      </w:pPr>
+      <w:r>
+        <w:rPr>
+          <w:rFonts w:eastAsia="黑体"/>
+          <w:b/>
+          <w:bCs/>
+        </w:rPr>
         <w:t>7 设计限制与后续输入</w:t>
       </w:r>
     </w:p>
     <w:p>
-      <w:r>
+      <w:pPr>
+        <w:spacing w:after="100" w:line="360" w:lineRule="auto"/>
+        <w:ind w:firstLine="475"/>
+      </w:pPr>
+      <w:r>
+        <w:rPr>
+          <w:rFonts w:eastAsia="宋体"/>
+          <w:color w:val="000000"/>
+          <w:sz w:val="24"/>
+          <w:szCs w:val="24"/>
+        </w:rPr>
         <w:t>本概要设计不替代后续 DBD、DLD、接口说明书、OpenAPI、ADR 或测试计划。任何外部字段、部署资源、坐标体系和中台能力未有受控证据时，标记【待人工确认】并按 Issue/变更流程处理。</w:t>
       </w:r>
     </w:p>

</xml_diff>

<commit_message>
docs: remediate G3-03 review findings
</commit_message>
<xml_diff>
--- a/docs/deliverables/11-概要设计说明书.docx
+++ b/docs/deliverables/11-概要设计说明书.docx
@@ -8,36 +8,7 @@
         <w:jc w:val="right"/>
       </w:pPr>
       <w:r>
-        <w:rPr>
-          <w:rFonts w:eastAsia="宋体"/>
-          <w:color w:val="000000"/>
-          <w:sz w:val="24"/>
-        </w:rPr>
-        <w:t>文档编号：</w:t>
-      </w:r>
-      <w:r>
-        <w:rPr>
-          <w:rFonts w:eastAsia="宋体"/>
-          <w:color w:val="000000"/>
-          <w:sz w:val="24"/>
-        </w:rPr>
-        <w:t>EM-G3-03</w:t>
-      </w:r>
-      <w:r>
-        <w:rPr>
-          <w:rFonts w:eastAsia="宋体"/>
-          <w:color w:val="000000"/>
-          <w:sz w:val="24"/>
-        </w:rPr>
-        <w:t xml:space="preserve">　　版本号：</w:t>
-      </w:r>
-      <w:r>
-        <w:rPr>
-          <w:rFonts w:eastAsia="宋体"/>
-          <w:color w:val="000000"/>
-          <w:sz w:val="24"/>
-        </w:rPr>
-        <w:t>V0.2（评审稿）</w:t>
+        <w:t>文档编号：EM-G3-03　　版本号：V0.2（评审稿）</w:t>
       </w:r>
     </w:p>
     <w:p>
@@ -46,28 +17,7 @@
         <w:jc w:val="right"/>
       </w:pPr>
       <w:r>
-        <w:rPr>
-          <w:rFonts w:eastAsia="宋体"/>
-          <w:color w:val="000000"/>
-          <w:sz w:val="24"/>
-        </w:rPr>
-        <w:t>密　　级：内部</w:t>
-      </w:r>
-      <w:r>
-        <w:rPr>
-          <w:rFonts w:eastAsia="宋体"/>
-          <w:color w:val="000000"/>
-          <w:sz w:val="24"/>
-        </w:rPr>
-        <w:t xml:space="preserve"> · </w:t>
-      </w:r>
-      <w:r>
-        <w:rPr>
-          <w:rFonts w:eastAsia="宋体"/>
-          <w:color w:val="000000"/>
-          <w:sz w:val="24"/>
-        </w:rPr>
-        <w:t>教学用</w:t>
+        <w:t>密　　级：内部 · 评审用</w:t>
       </w:r>
     </w:p>
     <w:p>
@@ -85,40 +35,7 @@
         <w:jc w:val="center"/>
       </w:pPr>
       <w:r>
-        <w:rPr>
-          <w:rFonts w:eastAsia="黑体"/>
-          <w:b/>
-          <w:color w:val="000000"/>
-          <w:sz w:val="44"/>
-        </w:rPr>
-        <w:t>“</w:t>
-      </w:r>
-      <w:r>
-        <w:rPr>
-          <w:rFonts w:eastAsia="黑体"/>
-          <w:b/>
-          <w:color w:val="000000"/>
-          <w:sz w:val="44"/>
-        </w:rPr>
-        <w:t>某自然博物馆智能运营中心建设项目</w:t>
-      </w:r>
-      <w:r>
-        <w:rPr>
-          <w:rFonts w:eastAsia="黑体"/>
-          <w:b/>
-          <w:color w:val="000000"/>
-          <w:sz w:val="44"/>
-        </w:rPr>
-        <w:t>”</w:t>
-      </w:r>
-      <w:r>
-        <w:rPr>
-          <w:rFonts w:eastAsia="黑体"/>
-          <w:b/>
-          <w:color w:val="000000"/>
-          <w:sz w:val="44"/>
-        </w:rPr>
-        <w:t>遥感影像智能解译与地物提取平台建设项目</w:t>
+        <w:t>某自然博物馆智能运营中心建设项目——应急管理子系统</w:t>
       </w:r>
     </w:p>
     <w:p>
@@ -127,12 +44,6 @@
         <w:jc w:val="center"/>
       </w:pPr>
       <w:r>
-        <w:rPr>
-          <w:rFonts w:eastAsia="黑体"/>
-          <w:b/>
-          <w:color w:val="000000"/>
-          <w:sz w:val="56"/>
-        </w:rPr>
         <w:t>概要设计说明书</w:t>
       </w:r>
     </w:p>
@@ -162,28 +73,7 @@
         <w:jc w:val="left"/>
       </w:pPr>
       <w:r>
-        <w:rPr>
-          <w:rFonts w:eastAsia="仿宋"/>
-          <w:color w:val="000000"/>
-          <w:sz w:val="32"/>
-        </w:rPr>
-        <w:t>编制单位：通关实训第</w:t>
-      </w:r>
-      <w:r>
-        <w:rPr>
-          <w:rFonts w:eastAsia="仿宋"/>
-          <w:color w:val="000000"/>
-          <w:sz w:val="32"/>
-        </w:rPr>
-        <w:t xml:space="preserve"> 3 </w:t>
-      </w:r>
-      <w:r>
-        <w:rPr>
-          <w:rFonts w:eastAsia="仿宋"/>
-          <w:color w:val="000000"/>
-          <w:sz w:val="32"/>
-        </w:rPr>
-        <w:t>组</w:t>
+        <w:t>编制单位：项目组【待人工确认】</w:t>
       </w:r>
     </w:p>
     <w:p>
@@ -193,11 +83,6 @@
         <w:jc w:val="left"/>
       </w:pPr>
       <w:r>
-        <w:rPr>
-          <w:rFonts w:eastAsia="仿宋"/>
-          <w:color w:val="000000"/>
-          <w:sz w:val="32"/>
-        </w:rPr>
         <w:t>编　　制：A（项目负责人）【待人工确认】</w:t>
       </w:r>
     </w:p>
@@ -208,11 +93,6 @@
         <w:jc w:val="left"/>
       </w:pPr>
       <w:r>
-        <w:rPr>
-          <w:rFonts w:eastAsia="仿宋"/>
-          <w:color w:val="000000"/>
-          <w:sz w:val="32"/>
-        </w:rPr>
         <w:t>审　　核：C（需求与符合性复核）【待人工确认】</w:t>
       </w:r>
     </w:p>
@@ -223,28 +103,7 @@
         <w:jc w:val="left"/>
       </w:pPr>
       <w:r>
-        <w:rPr>
-          <w:rFonts w:eastAsia="仿宋"/>
-          <w:color w:val="000000"/>
-          <w:sz w:val="32"/>
-        </w:rPr>
-        <w:t>批　　准：评委会（</w:t>
-      </w:r>
-      <w:r>
-        <w:rPr>
-          <w:rFonts w:eastAsia="仿宋"/>
-          <w:color w:val="000000"/>
-          <w:sz w:val="32"/>
-        </w:rPr>
-        <w:t xml:space="preserve">M2 </w:t>
-      </w:r>
-      <w:r>
-        <w:rPr>
-          <w:rFonts w:eastAsia="仿宋"/>
-          <w:color w:val="000000"/>
-          <w:sz w:val="32"/>
-        </w:rPr>
-        <w:t>设计评审）</w:t>
+        <w:t>批　　准：【待 C Review】</w:t>
       </w:r>
     </w:p>
     <w:p>
@@ -254,60 +113,7 @@
         <w:jc w:val="left"/>
       </w:pPr>
       <w:r>
-        <w:rPr>
-          <w:rFonts w:eastAsia="仿宋"/>
-          <w:color w:val="000000"/>
-          <w:sz w:val="32"/>
-        </w:rPr>
-        <w:t>编制日期：</w:t>
-      </w:r>
-      <w:r>
-        <w:rPr>
-          <w:rFonts w:eastAsia="仿宋"/>
-          <w:color w:val="000000"/>
-          <w:sz w:val="32"/>
-        </w:rPr>
-        <w:t xml:space="preserve">2026 </w:t>
-      </w:r>
-      <w:r>
-        <w:rPr>
-          <w:rFonts w:eastAsia="仿宋"/>
-          <w:color w:val="000000"/>
-          <w:sz w:val="32"/>
-        </w:rPr>
-        <w:t>年</w:t>
-      </w:r>
-      <w:r>
-        <w:rPr>
-          <w:rFonts w:eastAsia="仿宋"/>
-          <w:color w:val="000000"/>
-          <w:sz w:val="32"/>
-        </w:rPr>
-        <w:t xml:space="preserve"> 8 </w:t>
-      </w:r>
-      <w:r>
-        <w:rPr>
-          <w:rFonts w:eastAsia="仿宋"/>
-          <w:color w:val="000000"/>
-          <w:sz w:val="32"/>
-        </w:rPr>
-        <w:t>月</w:t>
-      </w:r>
-      <w:r>
-        <w:rPr>
-          <w:rFonts w:eastAsia="仿宋"/>
-          <w:color w:val="000000"/>
-          <w:sz w:val="32"/>
-        </w:rPr>
-        <w:t xml:space="preserve"> 21 </w:t>
-      </w:r>
-      <w:r>
-        <w:rPr>
-          <w:rFonts w:eastAsia="仿宋"/>
-          <w:color w:val="000000"/>
-          <w:sz w:val="32"/>
-        </w:rPr>
-        <w:t>日</w:t>
+        <w:t>编制日期：2026 年 9 月 17 日</w:t>
       </w:r>
     </w:p>
     <w:p>
@@ -495,11 +301,6 @@
               <w:jc w:val="center"/>
             </w:pPr>
             <w:r>
-              <w:rPr>
-                <w:rFonts w:eastAsia="宋体"/>
-                <w:color w:val="000000"/>
-                <w:sz w:val="21"/>
-              </w:rPr>
               <w:t>V0.2</w:t>
             </w:r>
           </w:p>
@@ -513,11 +314,6 @@
               <w:jc w:val="center"/>
             </w:pPr>
             <w:r>
-              <w:rPr>
-                <w:rFonts w:eastAsia="宋体"/>
-                <w:color w:val="000000"/>
-                <w:sz w:val="21"/>
-              </w:rPr>
               <w:t>2026-09-17</w:t>
             </w:r>
           </w:p>
@@ -528,11 +324,6 @@
           </w:tcPr>
           <w:p>
             <w:r>
-              <w:rPr>
-                <w:rFonts w:eastAsia="宋体"/>
-                <w:color w:val="000000"/>
-                <w:sz w:val="21"/>
-              </w:rPr>
               <w:t>全部</w:t>
             </w:r>
           </w:p>
@@ -543,28 +334,7 @@
           </w:tcPr>
           <w:p>
             <w:r>
-              <w:rPr>
-                <w:rFonts w:eastAsia="宋体"/>
-                <w:color w:val="000000"/>
-                <w:sz w:val="21"/>
-              </w:rPr>
-              <w:t>首版，随设计冻结发布（</w:t>
-            </w:r>
-            <w:r>
-              <w:rPr>
-                <w:rFonts w:eastAsia="宋体"/>
-                <w:color w:val="000000"/>
-                <w:sz w:val="21"/>
-              </w:rPr>
-              <w:t>D8</w:t>
-            </w:r>
-            <w:r>
-              <w:rPr>
-                <w:rFonts w:eastAsia="宋体"/>
-                <w:color w:val="000000"/>
-                <w:sz w:val="21"/>
-              </w:rPr>
-              <w:t>）</w:t>
+              <w:t>首次形成概要设计评审稿，待 C 复核</w:t>
             </w:r>
           </w:p>
         </w:tc>
@@ -577,317 +347,6 @@
               <w:jc w:val="center"/>
             </w:pPr>
             <w:r>
-              <w:rPr>
-                <w:rFonts w:eastAsia="宋体"/>
-                <w:color w:val="000000"/>
-                <w:sz w:val="21"/>
-              </w:rPr>
-              <w:t>A【待人工确认】</w:t>
-            </w:r>
-          </w:p>
-        </w:tc>
-      </w:tr>
-      <w:tr>
-        <w:trPr>
-          <w:jc w:val="center"/>
-        </w:trPr>
-        <w:tc>
-          <w:tcPr>
-            <w:tcW w:w="1441" w:type="dxa"/>
-          </w:tcPr>
-          <w:p>
-            <w:pPr>
-              <w:jc w:val="center"/>
-            </w:pPr>
-            <w:r>
-              <w:rPr>
-                <w:rFonts w:eastAsia="宋体"/>
-                <w:color w:val="000000"/>
-                <w:sz w:val="21"/>
-              </w:rPr>
-              <w:t>V2.0</w:t>
-            </w:r>
-          </w:p>
-        </w:tc>
-        <w:tc>
-          <w:tcPr>
-            <w:tcW w:w="1462" w:type="dxa"/>
-          </w:tcPr>
-          <w:p>
-            <w:pPr>
-              <w:jc w:val="center"/>
-            </w:pPr>
-            <w:r>
-              <w:rPr>
-                <w:rFonts w:eastAsia="宋体"/>
-                <w:color w:val="000000"/>
-                <w:sz w:val="21"/>
-              </w:rPr>
-              <w:t>2026-08-20</w:t>
-            </w:r>
-          </w:p>
-        </w:tc>
-        <w:tc>
-          <w:tcPr>
-            <w:tcW w:w="1422" w:type="dxa"/>
-          </w:tcPr>
-          <w:p>
-            <w:r>
-              <w:rPr>
-                <w:rFonts w:eastAsia="宋体"/>
-                <w:color w:val="000000"/>
-                <w:sz w:val="21"/>
-              </w:rPr>
-              <w:t>第</w:t>
-            </w:r>
-            <w:r>
-              <w:rPr>
-                <w:rFonts w:eastAsia="宋体"/>
-                <w:color w:val="000000"/>
-                <w:sz w:val="21"/>
-              </w:rPr>
-              <w:t xml:space="preserve"> 5 </w:t>
-            </w:r>
-            <w:r>
-              <w:rPr>
-                <w:rFonts w:eastAsia="宋体"/>
-                <w:color w:val="000000"/>
-                <w:sz w:val="21"/>
-              </w:rPr>
-              <w:t>章</w:t>
-            </w:r>
-          </w:p>
-        </w:tc>
-        <w:tc>
-          <w:tcPr>
-            <w:tcW w:w="3303" w:type="dxa"/>
-          </w:tcPr>
-          <w:p>
-            <w:r>
-              <w:rPr>
-                <w:rFonts w:eastAsia="宋体"/>
-                <w:color w:val="000000"/>
-                <w:sz w:val="21"/>
-              </w:rPr>
-              <w:t>补充非功能设计的验证方式列；对齐测试计划（</w:t>
-            </w:r>
-            <w:r>
-              <w:rPr>
-                <w:rFonts w:eastAsia="宋体"/>
-                <w:color w:val="000000"/>
-                <w:sz w:val="21"/>
-              </w:rPr>
-              <w:t>D9</w:t>
-            </w:r>
-            <w:r>
-              <w:rPr>
-                <w:rFonts w:eastAsia="宋体"/>
-                <w:color w:val="000000"/>
-                <w:sz w:val="21"/>
-              </w:rPr>
-              <w:t>）</w:t>
-            </w:r>
-          </w:p>
-        </w:tc>
-        <w:tc>
-          <w:tcPr>
-            <w:tcW w:w="1388" w:type="dxa"/>
-          </w:tcPr>
-          <w:p>
-            <w:pPr>
-              <w:jc w:val="center"/>
-            </w:pPr>
-            <w:r>
-              <w:rPr>
-                <w:rFonts w:eastAsia="宋体"/>
-                <w:color w:val="000000"/>
-                <w:sz w:val="21"/>
-              </w:rPr>
-              <w:t>A【待人工确认】</w:t>
-            </w:r>
-          </w:p>
-        </w:tc>
-      </w:tr>
-      <w:tr>
-        <w:trPr>
-          <w:jc w:val="center"/>
-        </w:trPr>
-        <w:tc>
-          <w:tcPr>
-            <w:tcW w:w="1441" w:type="dxa"/>
-          </w:tcPr>
-          <w:p>
-            <w:pPr>
-              <w:jc w:val="center"/>
-            </w:pPr>
-            <w:r>
-              <w:rPr>
-                <w:rFonts w:eastAsia="宋体"/>
-                <w:color w:val="000000"/>
-                <w:sz w:val="21"/>
-              </w:rPr>
-              <w:t>V3.0</w:t>
-            </w:r>
-          </w:p>
-        </w:tc>
-        <w:tc>
-          <w:tcPr>
-            <w:tcW w:w="1462" w:type="dxa"/>
-          </w:tcPr>
-          <w:p>
-            <w:pPr>
-              <w:jc w:val="center"/>
-            </w:pPr>
-            <w:r>
-              <w:rPr>
-                <w:rFonts w:eastAsia="宋体"/>
-                <w:color w:val="000000"/>
-                <w:sz w:val="21"/>
-              </w:rPr>
-              <w:t>2026-08-20</w:t>
-            </w:r>
-          </w:p>
-        </w:tc>
-        <w:tc>
-          <w:tcPr>
-            <w:tcW w:w="1422" w:type="dxa"/>
-          </w:tcPr>
-          <w:p>
-            <w:r>
-              <w:rPr>
-                <w:rFonts w:eastAsia="宋体"/>
-                <w:color w:val="000000"/>
-                <w:sz w:val="21"/>
-              </w:rPr>
-              <w:t>第</w:t>
-            </w:r>
-            <w:r>
-              <w:rPr>
-                <w:rFonts w:eastAsia="宋体"/>
-                <w:color w:val="000000"/>
-                <w:sz w:val="21"/>
-              </w:rPr>
-              <w:t xml:space="preserve"> 3</w:t>
-            </w:r>
-            <w:r>
-              <w:rPr>
-                <w:rFonts w:eastAsia="宋体"/>
-                <w:color w:val="000000"/>
-                <w:sz w:val="21"/>
-              </w:rPr>
-              <w:t>、</w:t>
-            </w:r>
-            <w:r>
-              <w:rPr>
-                <w:rFonts w:eastAsia="宋体"/>
-                <w:color w:val="000000"/>
-                <w:sz w:val="21"/>
-              </w:rPr>
-              <w:t xml:space="preserve">4 </w:t>
-            </w:r>
-            <w:r>
-              <w:rPr>
-                <w:rFonts w:eastAsia="宋体"/>
-                <w:color w:val="000000"/>
-                <w:sz w:val="21"/>
-              </w:rPr>
-              <w:t>章</w:t>
-            </w:r>
-          </w:p>
-        </w:tc>
-        <w:tc>
-          <w:tcPr>
-            <w:tcW w:w="3303" w:type="dxa"/>
-          </w:tcPr>
-          <w:p>
-            <w:r>
-              <w:rPr>
-                <w:rFonts w:eastAsia="宋体"/>
-                <w:color w:val="000000"/>
-                <w:sz w:val="21"/>
-              </w:rPr>
-              <w:t>重锚：删除</w:t>
-            </w:r>
-            <w:r>
-              <w:rPr>
-                <w:rFonts w:eastAsia="宋体"/>
-                <w:color w:val="000000"/>
-                <w:sz w:val="21"/>
-              </w:rPr>
-              <w:t xml:space="preserve"> PostGIS/MinIO/Redis/Vue3 </w:t>
-            </w:r>
-            <w:r>
-              <w:rPr>
-                <w:rFonts w:eastAsia="宋体"/>
-                <w:color w:val="000000"/>
-                <w:sz w:val="21"/>
-              </w:rPr>
-              <w:t>四组件并在</w:t>
-            </w:r>
-            <w:r>
-              <w:rPr>
-                <w:rFonts w:eastAsia="宋体"/>
-                <w:color w:val="000000"/>
-                <w:sz w:val="21"/>
-              </w:rPr>
-              <w:t xml:space="preserve"> §3.3 </w:t>
-            </w:r>
-            <w:r>
-              <w:rPr>
-                <w:rFonts w:eastAsia="宋体"/>
-                <w:color w:val="000000"/>
-                <w:sz w:val="21"/>
-              </w:rPr>
-              <w:t>记录否决理由；</w:t>
-            </w:r>
-            <w:r>
-              <w:rPr>
-                <w:rFonts w:eastAsia="宋体"/>
-                <w:color w:val="000000"/>
-                <w:sz w:val="21"/>
-              </w:rPr>
-              <w:t xml:space="preserve">M3 </w:t>
-            </w:r>
-            <w:r>
-              <w:rPr>
-                <w:rFonts w:eastAsia="宋体"/>
-                <w:color w:val="000000"/>
-                <w:sz w:val="21"/>
-              </w:rPr>
-              <w:t>评审通过（</w:t>
-            </w:r>
-            <w:r>
-              <w:rPr>
-                <w:rFonts w:eastAsia="宋体"/>
-                <w:color w:val="000000"/>
-                <w:sz w:val="21"/>
-              </w:rPr>
-              <w:t>D9</w:t>
-            </w:r>
-            <w:r>
-              <w:rPr>
-                <w:rFonts w:eastAsia="宋体"/>
-                <w:color w:val="000000"/>
-                <w:sz w:val="21"/>
-              </w:rPr>
-              <w:t>）</w:t>
-            </w:r>
-          </w:p>
-        </w:tc>
-        <w:tc>
-          <w:tcPr>
-            <w:tcW w:w="1388" w:type="dxa"/>
-          </w:tcPr>
-          <w:p>
-            <w:pPr>
-              <w:jc w:val="center"/>
-            </w:pPr>
-            <w:r>
-              <w:rPr>
-                <w:rFonts w:eastAsia="宋体"/>
-                <w:color w:val="000000"/>
-                <w:sz w:val="21"/>
-              </w:rPr>
               <w:t>A【待人工确认】</w:t>
             </w:r>
           </w:p>

</xml_diff>

<commit_message>
docs: align G3-03 format with reference
</commit_message>
<xml_diff>
--- a/docs/deliverables/11-概要设计说明书.docx
+++ b/docs/deliverables/11-概要设计说明书.docx
@@ -382,8 +382,20 @@
     </w:p>
     <w:tbl>
       <w:tblPr>
-        <w:tblW w:type="auto" w:w="0"/>
-        <w:tblLook w:firstColumn="1" w:firstRow="1" w:lastColumn="0" w:lastRow="0" w:noHBand="0" w:noVBand="1" w:val="04A0"/>
+        <w:tblW w:w="5000" w:type="pct"/>
+        <w:tblBorders>
+          <w:top w:val="single" w:sz="2" w:space="0" w:color="8A9BA8"/>
+          <w:left w:val="single" w:sz="2" w:space="0" w:color="8A9BA8"/>
+          <w:bottom w:val="single" w:sz="2" w:space="0" w:color="8A9BA8"/>
+          <w:right w:val="single" w:sz="2" w:space="0" w:color="8A9BA8"/>
+          <w:insideH w:val="single" w:sz="2" w:space="0" w:color="8A9BA8"/>
+          <w:insideV w:val="single" w:sz="2" w:space="0" w:color="8A9BA8"/>
+        </w:tblBorders>
+        <w:tblCellMar>
+          <w:left w:w="10" w:type="dxa"/>
+          <w:right w:w="10" w:type="dxa"/>
+        </w:tblCellMar>
+        <w:tblLook w:val="04A0" w:firstRow="1" w:lastRow="0" w:firstColumn="1" w:lastColumn="0" w:noHBand="0" w:noVBand="1"/>
       </w:tblPr>
       <w:tblGrid>
         <w:gridCol w:w="3009"/>
@@ -640,8 +652,20 @@
     </w:p>
     <w:tbl>
       <w:tblPr>
-        <w:tblW w:type="auto" w:w="0"/>
-        <w:tblLook w:firstColumn="1" w:firstRow="1" w:lastColumn="0" w:lastRow="0" w:noHBand="0" w:noVBand="1" w:val="04A0"/>
+        <w:tblW w:w="5000" w:type="pct"/>
+        <w:tblBorders>
+          <w:top w:val="single" w:sz="2" w:space="0" w:color="8A9BA8"/>
+          <w:left w:val="single" w:sz="2" w:space="0" w:color="8A9BA8"/>
+          <w:bottom w:val="single" w:sz="2" w:space="0" w:color="8A9BA8"/>
+          <w:right w:val="single" w:sz="2" w:space="0" w:color="8A9BA8"/>
+          <w:insideH w:val="single" w:sz="2" w:space="0" w:color="8A9BA8"/>
+          <w:insideV w:val="single" w:sz="2" w:space="0" w:color="8A9BA8"/>
+        </w:tblBorders>
+        <w:tblCellMar>
+          <w:left w:w="10" w:type="dxa"/>
+          <w:right w:w="10" w:type="dxa"/>
+        </w:tblCellMar>
+        <w:tblLook w:val="04A0" w:firstRow="1" w:lastRow="0" w:firstColumn="1" w:lastColumn="0" w:noHBand="0" w:noVBand="1"/>
       </w:tblPr>
       <w:tblGrid>
         <w:gridCol w:w="3009"/>
@@ -835,8 +859,20 @@
     </w:p>
     <w:tbl>
       <w:tblPr>
-        <w:tblW w:type="auto" w:w="0"/>
-        <w:tblLook w:firstColumn="1" w:firstRow="1" w:lastColumn="0" w:lastRow="0" w:noHBand="0" w:noVBand="1" w:val="04A0"/>
+        <w:tblW w:w="5000" w:type="pct"/>
+        <w:tblBorders>
+          <w:top w:val="single" w:sz="2" w:space="0" w:color="8A9BA8"/>
+          <w:left w:val="single" w:sz="2" w:space="0" w:color="8A9BA8"/>
+          <w:bottom w:val="single" w:sz="2" w:space="0" w:color="8A9BA8"/>
+          <w:right w:val="single" w:sz="2" w:space="0" w:color="8A9BA8"/>
+          <w:insideH w:val="single" w:sz="2" w:space="0" w:color="8A9BA8"/>
+          <w:insideV w:val="single" w:sz="2" w:space="0" w:color="8A9BA8"/>
+        </w:tblBorders>
+        <w:tblCellMar>
+          <w:left w:w="10" w:type="dxa"/>
+          <w:right w:w="10" w:type="dxa"/>
+        </w:tblCellMar>
+        <w:tblLook w:val="04A0" w:firstRow="1" w:lastRow="0" w:firstColumn="1" w:lastColumn="0" w:noHBand="0" w:noVBand="1"/>
       </w:tblPr>
       <w:tblGrid>
         <w:gridCol w:w="3009"/>
@@ -1080,8 +1116,20 @@
     </w:p>
     <w:tbl>
       <w:tblPr>
-        <w:tblW w:type="auto" w:w="0"/>
-        <w:tblLook w:firstColumn="1" w:firstRow="1" w:lastColumn="0" w:lastRow="0" w:noHBand="0" w:noVBand="1" w:val="04A0"/>
+        <w:tblW w:w="5000" w:type="pct"/>
+        <w:tblBorders>
+          <w:top w:val="single" w:sz="2" w:space="0" w:color="8A9BA8"/>
+          <w:left w:val="single" w:sz="2" w:space="0" w:color="8A9BA8"/>
+          <w:bottom w:val="single" w:sz="2" w:space="0" w:color="8A9BA8"/>
+          <w:right w:val="single" w:sz="2" w:space="0" w:color="8A9BA8"/>
+          <w:insideH w:val="single" w:sz="2" w:space="0" w:color="8A9BA8"/>
+          <w:insideV w:val="single" w:sz="2" w:space="0" w:color="8A9BA8"/>
+        </w:tblBorders>
+        <w:tblCellMar>
+          <w:left w:w="10" w:type="dxa"/>
+          <w:right w:w="10" w:type="dxa"/>
+        </w:tblCellMar>
+        <w:tblLook w:val="04A0" w:firstRow="1" w:lastRow="0" w:firstColumn="1" w:lastColumn="0" w:noHBand="0" w:noVBand="1"/>
       </w:tblPr>
       <w:tblGrid>
         <w:gridCol w:w="3009"/>
@@ -1325,8 +1373,20 @@
     </w:p>
     <w:tbl>
       <w:tblPr>
-        <w:tblW w:type="auto" w:w="0"/>
-        <w:tblLook w:firstColumn="1" w:firstRow="1" w:lastColumn="0" w:lastRow="0" w:noHBand="0" w:noVBand="1" w:val="04A0"/>
+        <w:tblW w:w="5000" w:type="pct"/>
+        <w:tblBorders>
+          <w:top w:val="single" w:sz="2" w:space="0" w:color="8A9BA8"/>
+          <w:left w:val="single" w:sz="2" w:space="0" w:color="8A9BA8"/>
+          <w:bottom w:val="single" w:sz="2" w:space="0" w:color="8A9BA8"/>
+          <w:right w:val="single" w:sz="2" w:space="0" w:color="8A9BA8"/>
+          <w:insideH w:val="single" w:sz="2" w:space="0" w:color="8A9BA8"/>
+          <w:insideV w:val="single" w:sz="2" w:space="0" w:color="8A9BA8"/>
+        </w:tblBorders>
+        <w:tblCellMar>
+          <w:left w:w="10" w:type="dxa"/>
+          <w:right w:w="10" w:type="dxa"/>
+        </w:tblCellMar>
+        <w:tblLook w:val="04A0" w:firstRow="1" w:lastRow="0" w:firstColumn="1" w:lastColumn="0" w:noHBand="0" w:noVBand="1"/>
       </w:tblPr>
       <w:tblGrid>
         <w:gridCol w:w="4513"/>
@@ -1519,8 +1579,20 @@
     </w:p>
     <w:tbl>
       <w:tblPr>
-        <w:tblW w:type="auto" w:w="0"/>
-        <w:tblLook w:firstColumn="1" w:firstRow="1" w:lastColumn="0" w:lastRow="0" w:noHBand="0" w:noVBand="1" w:val="04A0"/>
+        <w:tblW w:w="5000" w:type="pct"/>
+        <w:tblBorders>
+          <w:top w:val="single" w:sz="2" w:space="0" w:color="8A9BA8"/>
+          <w:left w:val="single" w:sz="2" w:space="0" w:color="8A9BA8"/>
+          <w:bottom w:val="single" w:sz="2" w:space="0" w:color="8A9BA8"/>
+          <w:right w:val="single" w:sz="2" w:space="0" w:color="8A9BA8"/>
+          <w:insideH w:val="single" w:sz="2" w:space="0" w:color="8A9BA8"/>
+          <w:insideV w:val="single" w:sz="2" w:space="0" w:color="8A9BA8"/>
+        </w:tblBorders>
+        <w:tblCellMar>
+          <w:left w:w="10" w:type="dxa"/>
+          <w:right w:w="10" w:type="dxa"/>
+        </w:tblCellMar>
+        <w:tblLook w:val="04A0" w:firstRow="1" w:lastRow="0" w:firstColumn="1" w:lastColumn="0" w:noHBand="0" w:noVBand="1"/>
       </w:tblPr>
       <w:tblGrid>
         <w:gridCol w:w="3009"/>
@@ -1682,8 +1754,20 @@
     </w:p>
     <w:tbl>
       <w:tblPr>
-        <w:tblW w:type="auto" w:w="0"/>
-        <w:tblLook w:firstColumn="1" w:firstRow="1" w:lastColumn="0" w:lastRow="0" w:noHBand="0" w:noVBand="1" w:val="04A0"/>
+        <w:tblW w:w="5000" w:type="pct"/>
+        <w:tblBorders>
+          <w:top w:val="single" w:sz="2" w:space="0" w:color="8A9BA8"/>
+          <w:left w:val="single" w:sz="2" w:space="0" w:color="8A9BA8"/>
+          <w:bottom w:val="single" w:sz="2" w:space="0" w:color="8A9BA8"/>
+          <w:right w:val="single" w:sz="2" w:space="0" w:color="8A9BA8"/>
+          <w:insideH w:val="single" w:sz="2" w:space="0" w:color="8A9BA8"/>
+          <w:insideV w:val="single" w:sz="2" w:space="0" w:color="8A9BA8"/>
+        </w:tblBorders>
+        <w:tblCellMar>
+          <w:left w:w="10" w:type="dxa"/>
+          <w:right w:w="10" w:type="dxa"/>
+        </w:tblCellMar>
+        <w:tblLook w:val="04A0" w:firstRow="1" w:lastRow="0" w:firstColumn="1" w:lastColumn="0" w:noHBand="0" w:noVBand="1"/>
       </w:tblPr>
       <w:tblGrid>
         <w:gridCol w:w="3009"/>
@@ -1877,8 +1961,20 @@
     </w:p>
     <w:tbl>
       <w:tblPr>
-        <w:tblW w:type="auto" w:w="0"/>
-        <w:tblLook w:firstColumn="1" w:firstRow="1" w:lastColumn="0" w:lastRow="0" w:noHBand="0" w:noVBand="1" w:val="04A0"/>
+        <w:tblW w:w="5000" w:type="pct"/>
+        <w:tblBorders>
+          <w:top w:val="single" w:sz="2" w:space="0" w:color="8A9BA8"/>
+          <w:left w:val="single" w:sz="2" w:space="0" w:color="8A9BA8"/>
+          <w:bottom w:val="single" w:sz="2" w:space="0" w:color="8A9BA8"/>
+          <w:right w:val="single" w:sz="2" w:space="0" w:color="8A9BA8"/>
+          <w:insideH w:val="single" w:sz="2" w:space="0" w:color="8A9BA8"/>
+          <w:insideV w:val="single" w:sz="2" w:space="0" w:color="8A9BA8"/>
+        </w:tblBorders>
+        <w:tblCellMar>
+          <w:left w:w="10" w:type="dxa"/>
+          <w:right w:w="10" w:type="dxa"/>
+        </w:tblCellMar>
+        <w:tblLook w:val="04A0" w:firstRow="1" w:lastRow="0" w:firstColumn="1" w:lastColumn="0" w:noHBand="0" w:noVBand="1"/>
       </w:tblPr>
       <w:tblGrid>
         <w:gridCol w:w="3009"/>
@@ -2135,8 +2231,20 @@
     </w:p>
     <w:tbl>
       <w:tblPr>
-        <w:tblW w:type="auto" w:w="0"/>
-        <w:tblLook w:firstColumn="1" w:firstRow="1" w:lastColumn="0" w:lastRow="0" w:noHBand="0" w:noVBand="1" w:val="04A0"/>
+        <w:tblW w:w="5000" w:type="pct"/>
+        <w:tblBorders>
+          <w:top w:val="single" w:sz="2" w:space="0" w:color="8A9BA8"/>
+          <w:left w:val="single" w:sz="2" w:space="0" w:color="8A9BA8"/>
+          <w:bottom w:val="single" w:sz="2" w:space="0" w:color="8A9BA8"/>
+          <w:right w:val="single" w:sz="2" w:space="0" w:color="8A9BA8"/>
+          <w:insideH w:val="single" w:sz="2" w:space="0" w:color="8A9BA8"/>
+          <w:insideV w:val="single" w:sz="2" w:space="0" w:color="8A9BA8"/>
+        </w:tblBorders>
+        <w:tblCellMar>
+          <w:left w:w="10" w:type="dxa"/>
+          <w:right w:w="10" w:type="dxa"/>
+        </w:tblCellMar>
+        <w:tblLook w:val="04A0" w:firstRow="1" w:lastRow="0" w:firstColumn="1" w:lastColumn="0" w:noHBand="0" w:noVBand="1"/>
       </w:tblPr>
       <w:tblGrid>
         <w:gridCol w:w="3009"/>
@@ -2330,8 +2438,20 @@
     </w:p>
     <w:tbl>
       <w:tblPr>
-        <w:tblW w:type="auto" w:w="0"/>
-        <w:tblLook w:firstColumn="1" w:firstRow="1" w:lastColumn="0" w:lastRow="0" w:noHBand="0" w:noVBand="1" w:val="04A0"/>
+        <w:tblW w:w="5000" w:type="pct"/>
+        <w:tblBorders>
+          <w:top w:val="single" w:sz="2" w:space="0" w:color="8A9BA8"/>
+          <w:left w:val="single" w:sz="2" w:space="0" w:color="8A9BA8"/>
+          <w:bottom w:val="single" w:sz="2" w:space="0" w:color="8A9BA8"/>
+          <w:right w:val="single" w:sz="2" w:space="0" w:color="8A9BA8"/>
+          <w:insideH w:val="single" w:sz="2" w:space="0" w:color="8A9BA8"/>
+          <w:insideV w:val="single" w:sz="2" w:space="0" w:color="8A9BA8"/>
+        </w:tblBorders>
+        <w:tblCellMar>
+          <w:left w:w="10" w:type="dxa"/>
+          <w:right w:w="10" w:type="dxa"/>
+        </w:tblCellMar>
+        <w:tblLook w:val="04A0" w:firstRow="1" w:lastRow="0" w:firstColumn="1" w:lastColumn="0" w:noHBand="0" w:noVBand="1"/>
       </w:tblPr>
       <w:tblGrid>
         <w:gridCol w:w="3009"/>
@@ -2525,8 +2645,20 @@
     </w:p>
     <w:tbl>
       <w:tblPr>
-        <w:tblW w:type="auto" w:w="0"/>
-        <w:tblLook w:firstColumn="1" w:firstRow="1" w:lastColumn="0" w:lastRow="0" w:noHBand="0" w:noVBand="1" w:val="04A0"/>
+        <w:tblW w:w="5000" w:type="pct"/>
+        <w:tblBorders>
+          <w:top w:val="single" w:sz="2" w:space="0" w:color="8A9BA8"/>
+          <w:left w:val="single" w:sz="2" w:space="0" w:color="8A9BA8"/>
+          <w:bottom w:val="single" w:sz="2" w:space="0" w:color="8A9BA8"/>
+          <w:right w:val="single" w:sz="2" w:space="0" w:color="8A9BA8"/>
+          <w:insideH w:val="single" w:sz="2" w:space="0" w:color="8A9BA8"/>
+          <w:insideV w:val="single" w:sz="2" w:space="0" w:color="8A9BA8"/>
+        </w:tblBorders>
+        <w:tblCellMar>
+          <w:left w:w="10" w:type="dxa"/>
+          <w:right w:w="10" w:type="dxa"/>
+        </w:tblCellMar>
+        <w:tblLook w:val="04A0" w:firstRow="1" w:lastRow="0" w:firstColumn="1" w:lastColumn="0" w:noHBand="0" w:noVBand="1"/>
       </w:tblPr>
       <w:tblGrid>
         <w:gridCol w:w="3009"/>

</xml_diff>

<commit_message>
docs(g3): apply simulated confirmations and reopen m3 review
</commit_message>
<xml_diff>
--- a/docs/deliverables/11-概要设计说明书.docx
+++ b/docs/deliverables/11-概要设计说明书.docx
@@ -73,7 +73,7 @@
         <w:jc w:val="left"/>
       </w:pPr>
       <w:r>
-        <w:t>编制单位：项目组【待人工确认】</w:t>
+        <w:t>编制单位：020202项目组</w:t>
       </w:r>
     </w:p>
     <w:p>
@@ -83,7 +83,7 @@
         <w:jc w:val="left"/>
       </w:pPr>
       <w:r>
-        <w:t>编　　制：A（项目负责人）【待人工确认】</w:t>
+        <w:t>编　　制：何思源（项目负责人）</w:t>
       </w:r>
     </w:p>
     <w:p>
@@ -93,7 +93,7 @@
         <w:jc w:val="left"/>
       </w:pPr>
       <w:r>
-        <w:t>审　　核：C（需求与符合性复核）【待人工确认】</w:t>
+        <w:t>审　　核：任俊强（需求与符合性复核）</w:t>
       </w:r>
     </w:p>
     <w:p>
@@ -347,7 +347,7 @@
               <w:jc w:val="center"/>
             </w:pPr>
             <w:r>
-              <w:t>A【待人工确认】</w:t>
+              <w:t>何思源</w:t>
             </w:r>
           </w:p>
         </w:tc>
@@ -2803,6 +2803,35 @@
           <w:b/>
         </w:rPr>
         <w:t>表 13-1 演进路径</w:t>
+      </w:r>
+    </w:p>
+    <w:p>
+      <w:r>
+        <w:br w:type="page"/>
+      </w:r>
+    </w:p>
+    <w:p>
+      <w:pPr>
+        <w:pStyle w:val="1"/>
+      </w:pPr>
+      <w:r>
+        <w:t>课程项目模拟确认补充</w:t>
+      </w:r>
+    </w:p>
+    <w:p>
+      <w:pPr>
+        <w:jc w:val="both"/>
+      </w:pPr>
+      <w:r>
+        <w:t>课程模拟确认（SIMULATED_OWNER_CONFIRMATION）：开发、联调、验收网关分别为 https://gw-dev.museum-ops.example、https://gw-uat.museum-ops.example、https://gw-acc.museum-ops.example；业务接口前缀保持 /api/v1。</w:t>
+      </w:r>
+    </w:p>
+    <w:p>
+      <w:pPr>
+        <w:jc w:val="both"/>
+      </w:pPr>
+      <w:r>
+        <w:t>课程模拟确认：业务坐标系采用 CGCS2000（EPSG:4490），二维 WMTS 1.0.0、楼层 WMS 1.3.0 + GeoJSON、三维 3D Tiles 1.1；H5 宿主为自然博物馆智慧管理 APP V3.8.0。</w:t>
       </w:r>
     </w:p>
     <w:sectPr>

</xml_diff>